<commit_message>
testing calibration without falling limb samples
</commit_message>
<xml_diff>
--- a/antecedent_conditions/masteller_model/masteller_parameter_calibration_summary.docx
+++ b/antecedent_conditions/masteller_model/masteller_parameter_calibration_summary.docx
@@ -66,21 +66,7 @@
           <w:sz w:val="24"/>
           <w:szCs w:val="24"/>
         </w:rPr>
-        <w:t xml:space="preserve">Assuming </w:t>
-      </w:r>
-      <w:r>
-        <w:rPr>
-          <w:sz w:val="24"/>
-          <w:szCs w:val="24"/>
-        </w:rPr>
-        <w:t>τ*c</w:t>
-      </w:r>
-      <w:r>
-        <w:rPr>
-          <w:sz w:val="24"/>
-          <w:szCs w:val="24"/>
-        </w:rPr>
-        <w:t xml:space="preserve"> re-initializes for data gaps</w:t>
+        <w:t>Assuming τ*c re-initializes for data gaps</w:t>
       </w:r>
     </w:p>
     <w:p>
@@ -481,21 +467,7 @@
                 <w:sz w:val="22"/>
                 <w:szCs w:val="22"/>
               </w:rPr>
-              <w:t>n=</w:t>
-            </w:r>
-            <w:r>
-              <w:rPr>
-                <w:sz w:val="22"/>
-                <w:szCs w:val="22"/>
-              </w:rPr>
-              <w:t>1</w:t>
-            </w:r>
-            <w:r>
-              <w:rPr>
-                <w:sz w:val="22"/>
-                <w:szCs w:val="22"/>
-              </w:rPr>
-              <w:t>0</w:t>
+              <w:t>n=10</w:t>
             </w:r>
           </w:p>
         </w:tc>
@@ -532,14 +504,7 @@
           <w:sz w:val="22"/>
           <w:szCs w:val="22"/>
         </w:rPr>
-        <w:t>Best fit</w:t>
-      </w:r>
-      <w:r>
-        <w:rPr>
-          <w:sz w:val="22"/>
-          <w:szCs w:val="22"/>
-        </w:rPr>
-        <w:t xml:space="preserve">: </w:t>
+        <w:t xml:space="preserve">Best fit: </w:t>
       </w:r>
     </w:p>
     <w:tbl>
@@ -608,14 +573,7 @@
                 <w:sz w:val="22"/>
                 <w:szCs w:val="22"/>
               </w:rPr>
-              <w:t xml:space="preserve">4.12 * </w:t>
-            </w:r>
-            <w:r>
-              <w:rPr>
-                <w:sz w:val="22"/>
-                <w:szCs w:val="22"/>
-              </w:rPr>
-              <w:t>10</w:t>
+              <w:t>4.12 * 10</w:t>
             </w:r>
             <w:r>
               <w:rPr>
@@ -682,28 +640,7 @@
                 <w:sz w:val="22"/>
                 <w:szCs w:val="22"/>
               </w:rPr>
-              <w:t>2</w:t>
-            </w:r>
-            <w:r>
-              <w:rPr>
-                <w:sz w:val="22"/>
-                <w:szCs w:val="22"/>
-              </w:rPr>
-              <w:t>.</w:t>
-            </w:r>
-            <w:r>
-              <w:rPr>
-                <w:sz w:val="22"/>
-                <w:szCs w:val="22"/>
-              </w:rPr>
-              <w:t>29</w:t>
-            </w:r>
-            <w:r>
-              <w:rPr>
-                <w:sz w:val="22"/>
-                <w:szCs w:val="22"/>
-              </w:rPr>
-              <w:t xml:space="preserve"> * 10</w:t>
+              <w:t>2.29 * 10</w:t>
             </w:r>
             <w:r>
               <w:rPr>
@@ -711,15 +648,7 @@
                 <w:szCs w:val="22"/>
                 <w:vertAlign w:val="superscript"/>
               </w:rPr>
-              <w:t>-</w:t>
-            </w:r>
-            <w:r>
-              <w:rPr>
-                <w:sz w:val="22"/>
-                <w:szCs w:val="22"/>
-                <w:vertAlign w:val="superscript"/>
-              </w:rPr>
-              <w:t>4</w:t>
+              <w:t>-4</w:t>
             </w:r>
           </w:p>
         </w:tc>
@@ -877,7 +806,7 @@
           <w:szCs w:val="22"/>
         </w:rPr>
         <w:drawing>
-          <wp:inline distT="0" distB="0" distL="0" distR="0" wp14:anchorId="7BE4C8E7" wp14:editId="7F9D8FEF">
+          <wp:inline distT="0" distB="0" distL="0" distR="0" wp14:anchorId="7BE4C8E7" wp14:editId="0A2C8C82">
             <wp:extent cx="3979316" cy="1563394"/>
             <wp:effectExtent l="0" t="0" r="2540" b="0"/>
             <wp:docPr id="1703571791" name="Picture 2"/>
@@ -1585,7 +1514,7 @@
         </w:rPr>
         <w:lastRenderedPageBreak/>
         <w:drawing>
-          <wp:inline distT="0" distB="0" distL="0" distR="0" wp14:anchorId="679B8F3B" wp14:editId="7B8CAD1B">
+          <wp:inline distT="0" distB="0" distL="0" distR="0" wp14:anchorId="679B8F3B" wp14:editId="5D290834">
             <wp:extent cx="3825697" cy="1503040"/>
             <wp:effectExtent l="0" t="0" r="3810" b="2540"/>
             <wp:docPr id="704999060" name="Picture 3"/>
@@ -1765,15 +1694,7 @@
                 <w:szCs w:val="22"/>
                 <w:vertAlign w:val="superscript"/>
               </w:rPr>
-              <w:t>-</w:t>
-            </w:r>
-            <w:r>
-              <w:rPr>
-                <w:sz w:val="22"/>
-                <w:szCs w:val="22"/>
-                <w:vertAlign w:val="superscript"/>
-              </w:rPr>
-              <w:t>4</w:t>
+              <w:t>-4</w:t>
             </w:r>
           </w:p>
         </w:tc>
@@ -1859,7 +1780,14 @@
                 <w:szCs w:val="22"/>
                 <w:vertAlign w:val="superscript"/>
               </w:rPr>
-              <w:t>-</w:t>
+              <w:t>-5</w:t>
+            </w:r>
+            <w:r>
+              <w:rPr>
+                <w:sz w:val="22"/>
+                <w:szCs w:val="22"/>
+              </w:rPr>
+              <w:t xml:space="preserve"> – 10</w:t>
             </w:r>
             <w:r>
               <w:rPr>
@@ -1867,30 +1795,7 @@
                 <w:szCs w:val="22"/>
                 <w:vertAlign w:val="superscript"/>
               </w:rPr>
-              <w:t>5</w:t>
-            </w:r>
-            <w:r>
-              <w:rPr>
-                <w:sz w:val="22"/>
-                <w:szCs w:val="22"/>
-              </w:rPr>
-              <w:t xml:space="preserve"> – 10</w:t>
-            </w:r>
-            <w:r>
-              <w:rPr>
-                <w:sz w:val="22"/>
-                <w:szCs w:val="22"/>
-                <w:vertAlign w:val="superscript"/>
-              </w:rPr>
-              <w:t>-</w:t>
-            </w:r>
-            <w:r>
-              <w:rPr>
-                <w:sz w:val="22"/>
-                <w:szCs w:val="22"/>
-                <w:vertAlign w:val="superscript"/>
-              </w:rPr>
-              <w:t>3</w:t>
+              <w:t>-3</w:t>
             </w:r>
           </w:p>
         </w:tc>
@@ -2197,14 +2102,7 @@
                 <w:sz w:val="22"/>
                 <w:szCs w:val="22"/>
               </w:rPr>
-              <w:t>4.64</w:t>
-            </w:r>
-            <w:r>
-              <w:rPr>
-                <w:sz w:val="22"/>
-                <w:szCs w:val="22"/>
-              </w:rPr>
-              <w:t xml:space="preserve"> * 10</w:t>
+              <w:t>4.64 * 10</w:t>
             </w:r>
             <w:r>
               <w:rPr>
@@ -2281,14 +2179,7 @@
           <w:sz w:val="22"/>
           <w:szCs w:val="22"/>
         </w:rPr>
-        <w:t>MAE = 0.01</w:t>
-      </w:r>
-      <w:r>
-        <w:rPr>
-          <w:sz w:val="22"/>
-          <w:szCs w:val="22"/>
-        </w:rPr>
-        <w:t>202</w:t>
+        <w:t>MAE = 0.01202</w:t>
       </w:r>
     </w:p>
     <w:p>
@@ -2307,7 +2198,7 @@
           <w:szCs w:val="22"/>
         </w:rPr>
         <w:drawing>
-          <wp:inline distT="0" distB="0" distL="0" distR="0" wp14:anchorId="55FA6CA9" wp14:editId="0174DE9C">
+          <wp:inline distT="0" distB="0" distL="0" distR="0" wp14:anchorId="55FA6CA9" wp14:editId="0F196AF6">
             <wp:extent cx="3984557" cy="1565453"/>
             <wp:effectExtent l="0" t="0" r="0" b="0"/>
             <wp:docPr id="462658038" name="Picture 4"/>
@@ -2687,21 +2578,7 @@
                 <w:sz w:val="22"/>
                 <w:szCs w:val="22"/>
               </w:rPr>
-              <w:t>n=</w:t>
-            </w:r>
-            <w:r>
-              <w:rPr>
-                <w:sz w:val="22"/>
-                <w:szCs w:val="22"/>
-              </w:rPr>
-              <w:t>2</w:t>
-            </w:r>
-            <w:r>
-              <w:rPr>
-                <w:sz w:val="22"/>
-                <w:szCs w:val="22"/>
-              </w:rPr>
-              <w:t>0</w:t>
+              <w:t>n=20</w:t>
             </w:r>
           </w:p>
         </w:tc>
@@ -2916,28 +2793,7 @@
                 <w:sz w:val="22"/>
                 <w:szCs w:val="22"/>
               </w:rPr>
-              <w:t>3</w:t>
-            </w:r>
-            <w:r>
-              <w:rPr>
-                <w:sz w:val="22"/>
-                <w:szCs w:val="22"/>
-              </w:rPr>
-              <w:t>.</w:t>
-            </w:r>
-            <w:r>
-              <w:rPr>
-                <w:sz w:val="22"/>
-                <w:szCs w:val="22"/>
-              </w:rPr>
-              <w:t>07</w:t>
-            </w:r>
-            <w:r>
-              <w:rPr>
-                <w:sz w:val="22"/>
-                <w:szCs w:val="22"/>
-              </w:rPr>
-              <w:t xml:space="preserve"> * 10</w:t>
+              <w:t>3.07 * 10</w:t>
             </w:r>
             <w:r>
               <w:rPr>
@@ -2945,15 +2801,7 @@
                 <w:szCs w:val="22"/>
                 <w:vertAlign w:val="superscript"/>
               </w:rPr>
-              <w:t>-</w:t>
-            </w:r>
-            <w:r>
-              <w:rPr>
-                <w:sz w:val="22"/>
-                <w:szCs w:val="22"/>
-                <w:vertAlign w:val="superscript"/>
-              </w:rPr>
-              <w:t>4</w:t>
+              <w:t>-4</w:t>
             </w:r>
           </w:p>
         </w:tc>
@@ -3002,14 +2850,7 @@
                 <w:sz w:val="22"/>
                 <w:szCs w:val="22"/>
               </w:rPr>
-              <w:t>1</w:t>
-            </w:r>
-            <w:r>
-              <w:rPr>
-                <w:sz w:val="22"/>
-                <w:szCs w:val="22"/>
-              </w:rPr>
-              <w:t>.789</w:t>
+              <w:t>1.789</w:t>
             </w:r>
           </w:p>
         </w:tc>
@@ -3029,14 +2870,7 @@
           <w:sz w:val="22"/>
           <w:szCs w:val="22"/>
         </w:rPr>
-        <w:t>MAE = 0.01</w:t>
-      </w:r>
-      <w:r>
-        <w:rPr>
-          <w:sz w:val="22"/>
-          <w:szCs w:val="22"/>
-        </w:rPr>
-        <w:t>18</w:t>
+        <w:t>MAE = 0.0118</w:t>
       </w:r>
     </w:p>
     <w:p>
@@ -3270,7 +3104,7 @@
           <w:szCs w:val="22"/>
         </w:rPr>
         <w:drawing>
-          <wp:inline distT="0" distB="0" distL="0" distR="0" wp14:anchorId="567F008F" wp14:editId="1E78E19D">
+          <wp:inline distT="0" distB="0" distL="0" distR="0" wp14:anchorId="567F008F" wp14:editId="2643B8E8">
             <wp:extent cx="2644065" cy="1514246"/>
             <wp:effectExtent l="0" t="0" r="4445" b="0"/>
             <wp:docPr id="905873310" name="Picture 7"/>
@@ -3325,7 +3159,7 @@
           <w:szCs w:val="22"/>
         </w:rPr>
         <w:drawing>
-          <wp:inline distT="0" distB="0" distL="0" distR="0" wp14:anchorId="3FC607F9" wp14:editId="5EDB4F2A">
+          <wp:inline distT="0" distB="0" distL="0" distR="0" wp14:anchorId="3FC607F9" wp14:editId="2C7882EE">
             <wp:extent cx="2649158" cy="1513764"/>
             <wp:effectExtent l="0" t="0" r="0" b="0"/>
             <wp:docPr id="920090444" name="Picture 8"/>
@@ -3416,21 +3250,7 @@
           <w:sz w:val="24"/>
           <w:szCs w:val="24"/>
         </w:rPr>
-        <w:t xml:space="preserve">Assuming </w:t>
-      </w:r>
-      <w:r>
-        <w:rPr>
-          <w:sz w:val="24"/>
-          <w:szCs w:val="24"/>
-        </w:rPr>
-        <w:t>τ*c</w:t>
-      </w:r>
-      <w:r>
-        <w:rPr>
-          <w:sz w:val="24"/>
-          <w:szCs w:val="24"/>
-        </w:rPr>
-        <w:t xml:space="preserve"> continuous for data gaps</w:t>
+        <w:t>Assuming τ*c continuous for data gaps</w:t>
       </w:r>
     </w:p>
     <w:p>
@@ -3777,21 +3597,7 @@
                 <w:sz w:val="22"/>
                 <w:szCs w:val="22"/>
               </w:rPr>
-              <w:t>1</w:t>
-            </w:r>
-            <w:r>
-              <w:rPr>
-                <w:sz w:val="22"/>
-                <w:szCs w:val="22"/>
-              </w:rPr>
-              <w:t>-</w:t>
-            </w:r>
-            <w:r>
-              <w:rPr>
-                <w:sz w:val="22"/>
-                <w:szCs w:val="22"/>
-              </w:rPr>
-              <w:t>10</w:t>
+              <w:t>1-10</w:t>
             </w:r>
           </w:p>
         </w:tc>
@@ -3813,21 +3619,7 @@
                 <w:sz w:val="22"/>
                 <w:szCs w:val="22"/>
               </w:rPr>
-              <w:t>n=</w:t>
-            </w:r>
-            <w:r>
-              <w:rPr>
-                <w:sz w:val="22"/>
-                <w:szCs w:val="22"/>
-              </w:rPr>
-              <w:t>1</w:t>
-            </w:r>
-            <w:r>
-              <w:rPr>
-                <w:sz w:val="22"/>
-                <w:szCs w:val="22"/>
-              </w:rPr>
-              <w:t>0</w:t>
+              <w:t>n=10</w:t>
             </w:r>
           </w:p>
         </w:tc>
@@ -4042,21 +3834,7 @@
                 <w:sz w:val="22"/>
                 <w:szCs w:val="22"/>
               </w:rPr>
-              <w:t>3.</w:t>
-            </w:r>
-            <w:r>
-              <w:rPr>
-                <w:sz w:val="22"/>
-                <w:szCs w:val="22"/>
-              </w:rPr>
-              <w:t>8</w:t>
-            </w:r>
-            <w:r>
-              <w:rPr>
-                <w:sz w:val="22"/>
-                <w:szCs w:val="22"/>
-              </w:rPr>
-              <w:t xml:space="preserve"> * 10</w:t>
+              <w:t>3.8 * 10</w:t>
             </w:r>
             <w:r>
               <w:rPr>
@@ -4064,15 +3842,7 @@
                 <w:szCs w:val="22"/>
                 <w:vertAlign w:val="superscript"/>
               </w:rPr>
-              <w:t>-</w:t>
-            </w:r>
-            <w:r>
-              <w:rPr>
-                <w:sz w:val="22"/>
-                <w:szCs w:val="22"/>
-                <w:vertAlign w:val="superscript"/>
-              </w:rPr>
-              <w:t>3</w:t>
+              <w:t>-3</w:t>
             </w:r>
           </w:p>
         </w:tc>
@@ -4141,14 +3911,7 @@
           <w:sz w:val="22"/>
           <w:szCs w:val="22"/>
         </w:rPr>
-        <w:t>MAE = 0.01</w:t>
-      </w:r>
-      <w:r>
-        <w:rPr>
-          <w:sz w:val="22"/>
-          <w:szCs w:val="22"/>
-        </w:rPr>
-        <w:t>9</w:t>
+        <w:t>MAE = 0.019</w:t>
       </w:r>
     </w:p>
     <w:p>
@@ -4269,6 +4032,7 @@
       </w:pPr>
       <w:r>
         <w:rPr>
+          <w:noProof/>
           <w:sz w:val="22"/>
           <w:szCs w:val="22"/>
         </w:rPr>
@@ -4348,21 +4112,7 @@
           <w:sz w:val="22"/>
           <w:szCs w:val="22"/>
         </w:rPr>
-        <w:t xml:space="preserve">to assuming a continuous value during data gaps, the MAE is 40.6% better when </w:t>
-      </w:r>
-      <w:r>
-        <w:rPr>
-          <w:sz w:val="22"/>
-          <w:szCs w:val="22"/>
-        </w:rPr>
-        <w:t>re-initializing</w:t>
-      </w:r>
-      <w:r>
-        <w:rPr>
-          <w:sz w:val="22"/>
-          <w:szCs w:val="22"/>
-        </w:rPr>
-        <w:t xml:space="preserve">. </w:t>
+        <w:t xml:space="preserve">to assuming a continuous value during data gaps, the MAE is 40.6% better when re-initializing. </w:t>
       </w:r>
     </w:p>
     <w:p>
@@ -4382,14 +4132,7 @@
           <w:sz w:val="24"/>
           <w:szCs w:val="24"/>
         </w:rPr>
-        <w:t xml:space="preserve">Assuming τ*c </w:t>
-      </w:r>
-      <w:r>
-        <w:rPr>
-          <w:sz w:val="24"/>
-          <w:szCs w:val="24"/>
-        </w:rPr>
-        <w:t xml:space="preserve">minimum for data gaps </w:t>
+        <w:t xml:space="preserve">Assuming τ*c minimum for data gaps </w:t>
       </w:r>
     </w:p>
     <w:p>
@@ -4451,21 +4194,7 @@
           <w:sz w:val="22"/>
           <w:szCs w:val="22"/>
         </w:rPr>
-        <w:t xml:space="preserve">during data </w:t>
-      </w:r>
-      <w:r>
-        <w:rPr>
-          <w:sz w:val="22"/>
-          <w:szCs w:val="22"/>
-        </w:rPr>
-        <w:t>gaps and</w:t>
-      </w:r>
-      <w:r>
-        <w:rPr>
-          <w:sz w:val="22"/>
-          <w:szCs w:val="22"/>
-        </w:rPr>
-        <w:t xml:space="preserve"> will continue to evolve when </w:t>
+        <w:t xml:space="preserve">during data gaps and will continue to evolve when </w:t>
       </w:r>
       <w:r>
         <w:rPr>
@@ -4490,14 +4219,7 @@
           <w:sz w:val="22"/>
           <w:szCs w:val="22"/>
         </w:rPr>
-        <w:t>record starts again</w:t>
-      </w:r>
-      <w:r>
-        <w:rPr>
-          <w:sz w:val="22"/>
-          <w:szCs w:val="22"/>
-        </w:rPr>
-        <w:t>.</w:t>
+        <w:t>record starts again.</w:t>
       </w:r>
     </w:p>
     <w:p>
@@ -4979,14 +4701,7 @@
                 <w:sz w:val="22"/>
                 <w:szCs w:val="22"/>
               </w:rPr>
-              <w:t>7.44</w:t>
-            </w:r>
-            <w:r>
-              <w:rPr>
-                <w:sz w:val="22"/>
-                <w:szCs w:val="22"/>
-              </w:rPr>
-              <w:t xml:space="preserve"> * 10</w:t>
+              <w:t>7.44 * 10</w:t>
             </w:r>
             <w:r>
               <w:rPr>
@@ -4994,15 +4709,7 @@
                 <w:szCs w:val="22"/>
                 <w:vertAlign w:val="superscript"/>
               </w:rPr>
-              <w:t>-</w:t>
-            </w:r>
-            <w:r>
-              <w:rPr>
-                <w:sz w:val="22"/>
-                <w:szCs w:val="22"/>
-                <w:vertAlign w:val="superscript"/>
-              </w:rPr>
-              <w:t>4</w:t>
+              <w:t>-4</w:t>
             </w:r>
           </w:p>
         </w:tc>
@@ -5129,6 +4836,7 @@
       </w:pPr>
       <w:r>
         <w:rPr>
+          <w:noProof/>
           <w:sz w:val="22"/>
           <w:szCs w:val="22"/>
         </w:rPr>
@@ -5186,9 +4894,2241 @@
           <w:sz w:val="24"/>
           <w:szCs w:val="24"/>
         </w:rPr>
+        <w:lastRenderedPageBreak/>
         <w:t>Not considering falling limb samples</w:t>
       </w:r>
     </w:p>
+    <w:p>
+      <w:pPr>
+        <w:pStyle w:val="Heading3"/>
+        <w:numPr>
+          <w:ilvl w:val="1"/>
+          <w:numId w:val="6"/>
+        </w:numPr>
+        <w:rPr>
+          <w:sz w:val="24"/>
+          <w:szCs w:val="24"/>
+        </w:rPr>
+      </w:pPr>
+      <w:r>
+        <w:rPr>
+          <w:sz w:val="24"/>
+          <w:szCs w:val="24"/>
+        </w:rPr>
+        <w:t>Assuming τ*c re-initializes</w:t>
+      </w:r>
+    </w:p>
+    <w:p>
+      <w:pPr>
+        <w:pStyle w:val="ListParagraph"/>
+        <w:ind w:left="360"/>
+        <w:rPr>
+          <w:sz w:val="22"/>
+          <w:szCs w:val="22"/>
+        </w:rPr>
+      </w:pPr>
+      <w:r>
+        <w:rPr>
+          <w:sz w:val="22"/>
+          <w:szCs w:val="22"/>
+        </w:rPr>
+        <w:t xml:space="preserve">Data ranges: </w:t>
+      </w:r>
+    </w:p>
+    <w:tbl>
+      <w:tblPr>
+        <w:tblStyle w:val="TableGrid"/>
+        <w:tblW w:w="0" w:type="auto"/>
+        <w:tblInd w:w="1597" w:type="dxa"/>
+        <w:tblLook w:val="04A0" w:firstRow="1" w:lastRow="0" w:firstColumn="1" w:lastColumn="0" w:noHBand="0" w:noVBand="1"/>
+      </w:tblPr>
+      <w:tblGrid>
+        <w:gridCol w:w="805"/>
+        <w:gridCol w:w="1260"/>
+        <w:gridCol w:w="720"/>
+      </w:tblGrid>
+      <w:tr>
+        <w:tc>
+          <w:tcPr>
+            <w:tcW w:w="805" w:type="dxa"/>
+          </w:tcPr>
+          <w:p>
+            <w:pPr>
+              <w:pStyle w:val="ListParagraph"/>
+              <w:ind w:left="0"/>
+              <w:jc w:val="center"/>
+              <w:rPr>
+                <w:sz w:val="22"/>
+                <w:szCs w:val="22"/>
+                <w:vertAlign w:val="subscript"/>
+              </w:rPr>
+            </w:pPr>
+            <w:r>
+              <w:rPr>
+                <w:sz w:val="22"/>
+                <w:szCs w:val="22"/>
+              </w:rPr>
+              <w:t>K</w:t>
+            </w:r>
+            <w:r>
+              <w:rPr>
+                <w:sz w:val="22"/>
+                <w:szCs w:val="22"/>
+                <w:vertAlign w:val="subscript"/>
+              </w:rPr>
+              <w:t>1</w:t>
+            </w:r>
+          </w:p>
+        </w:tc>
+        <w:tc>
+          <w:tcPr>
+            <w:tcW w:w="1260" w:type="dxa"/>
+          </w:tcPr>
+          <w:p>
+            <w:pPr>
+              <w:pStyle w:val="ListParagraph"/>
+              <w:ind w:left="0"/>
+              <w:rPr>
+                <w:sz w:val="22"/>
+                <w:szCs w:val="22"/>
+                <w:vertAlign w:val="superscript"/>
+              </w:rPr>
+            </w:pPr>
+            <w:r>
+              <w:rPr>
+                <w:sz w:val="22"/>
+                <w:szCs w:val="22"/>
+              </w:rPr>
+              <w:t>10</w:t>
+            </w:r>
+            <w:r>
+              <w:rPr>
+                <w:sz w:val="22"/>
+                <w:szCs w:val="22"/>
+                <w:vertAlign w:val="superscript"/>
+              </w:rPr>
+              <w:t>-6</w:t>
+            </w:r>
+            <w:r>
+              <w:rPr>
+                <w:sz w:val="22"/>
+                <w:szCs w:val="22"/>
+              </w:rPr>
+              <w:t xml:space="preserve"> – 10</w:t>
+            </w:r>
+            <w:r>
+              <w:rPr>
+                <w:sz w:val="22"/>
+                <w:szCs w:val="22"/>
+                <w:vertAlign w:val="superscript"/>
+              </w:rPr>
+              <w:t>-2</w:t>
+            </w:r>
+          </w:p>
+        </w:tc>
+        <w:tc>
+          <w:tcPr>
+            <w:tcW w:w="720" w:type="dxa"/>
+          </w:tcPr>
+          <w:p>
+            <w:pPr>
+              <w:pStyle w:val="ListParagraph"/>
+              <w:ind w:left="0"/>
+              <w:rPr>
+                <w:sz w:val="22"/>
+                <w:szCs w:val="22"/>
+              </w:rPr>
+            </w:pPr>
+            <w:r>
+              <w:rPr>
+                <w:sz w:val="22"/>
+                <w:szCs w:val="22"/>
+              </w:rPr>
+              <w:t>n=40</w:t>
+            </w:r>
+          </w:p>
+        </w:tc>
+      </w:tr>
+      <w:tr>
+        <w:tc>
+          <w:tcPr>
+            <w:tcW w:w="805" w:type="dxa"/>
+          </w:tcPr>
+          <w:p>
+            <w:pPr>
+              <w:pStyle w:val="ListParagraph"/>
+              <w:ind w:left="0"/>
+              <w:jc w:val="center"/>
+              <w:rPr>
+                <w:sz w:val="22"/>
+                <w:szCs w:val="22"/>
+                <w:vertAlign w:val="subscript"/>
+              </w:rPr>
+            </w:pPr>
+            <w:r>
+              <w:rPr>
+                <w:sz w:val="22"/>
+                <w:szCs w:val="22"/>
+              </w:rPr>
+              <w:t>K</w:t>
+            </w:r>
+            <w:r>
+              <w:rPr>
+                <w:sz w:val="22"/>
+                <w:szCs w:val="22"/>
+                <w:vertAlign w:val="subscript"/>
+              </w:rPr>
+              <w:t>2</w:t>
+            </w:r>
+          </w:p>
+        </w:tc>
+        <w:tc>
+          <w:tcPr>
+            <w:tcW w:w="1260" w:type="dxa"/>
+          </w:tcPr>
+          <w:p>
+            <w:pPr>
+              <w:pStyle w:val="ListParagraph"/>
+              <w:ind w:left="0"/>
+              <w:rPr>
+                <w:sz w:val="22"/>
+                <w:szCs w:val="22"/>
+              </w:rPr>
+            </w:pPr>
+            <w:r>
+              <w:rPr>
+                <w:sz w:val="22"/>
+                <w:szCs w:val="22"/>
+              </w:rPr>
+              <w:t>10</w:t>
+            </w:r>
+            <w:r>
+              <w:rPr>
+                <w:sz w:val="22"/>
+                <w:szCs w:val="22"/>
+                <w:vertAlign w:val="superscript"/>
+              </w:rPr>
+              <w:t>-6</w:t>
+            </w:r>
+            <w:r>
+              <w:rPr>
+                <w:sz w:val="22"/>
+                <w:szCs w:val="22"/>
+              </w:rPr>
+              <w:t xml:space="preserve"> – 10</w:t>
+            </w:r>
+            <w:r>
+              <w:rPr>
+                <w:sz w:val="22"/>
+                <w:szCs w:val="22"/>
+                <w:vertAlign w:val="superscript"/>
+              </w:rPr>
+              <w:t>-2</w:t>
+            </w:r>
+          </w:p>
+        </w:tc>
+        <w:tc>
+          <w:tcPr>
+            <w:tcW w:w="720" w:type="dxa"/>
+          </w:tcPr>
+          <w:p>
+            <w:pPr>
+              <w:pStyle w:val="ListParagraph"/>
+              <w:ind w:left="0"/>
+              <w:rPr>
+                <w:sz w:val="22"/>
+                <w:szCs w:val="22"/>
+              </w:rPr>
+            </w:pPr>
+            <w:r>
+              <w:rPr>
+                <w:sz w:val="22"/>
+                <w:szCs w:val="22"/>
+              </w:rPr>
+              <w:t>n=40</w:t>
+            </w:r>
+          </w:p>
+        </w:tc>
+      </w:tr>
+      <w:tr>
+        <w:tc>
+          <w:tcPr>
+            <w:tcW w:w="805" w:type="dxa"/>
+          </w:tcPr>
+          <w:p>
+            <w:pPr>
+              <w:pStyle w:val="ListParagraph"/>
+              <w:ind w:left="0"/>
+              <w:jc w:val="center"/>
+              <w:rPr>
+                <w:sz w:val="22"/>
+                <w:szCs w:val="22"/>
+              </w:rPr>
+            </w:pPr>
+            <w:r>
+              <w:rPr>
+                <w:rFonts w:ascii="Calibri" w:hAnsi="Calibri" w:cs="Calibri"/>
+                <w:sz w:val="22"/>
+                <w:szCs w:val="22"/>
+              </w:rPr>
+              <w:t>ε</w:t>
+            </w:r>
+          </w:p>
+        </w:tc>
+        <w:tc>
+          <w:tcPr>
+            <w:tcW w:w="1260" w:type="dxa"/>
+          </w:tcPr>
+          <w:p>
+            <w:pPr>
+              <w:pStyle w:val="ListParagraph"/>
+              <w:ind w:left="0"/>
+              <w:rPr>
+                <w:sz w:val="22"/>
+                <w:szCs w:val="22"/>
+              </w:rPr>
+            </w:pPr>
+            <w:r>
+              <w:rPr>
+                <w:sz w:val="22"/>
+                <w:szCs w:val="22"/>
+              </w:rPr>
+              <w:t>1-10</w:t>
+            </w:r>
+          </w:p>
+        </w:tc>
+        <w:tc>
+          <w:tcPr>
+            <w:tcW w:w="720" w:type="dxa"/>
+          </w:tcPr>
+          <w:p>
+            <w:pPr>
+              <w:pStyle w:val="ListParagraph"/>
+              <w:ind w:left="0"/>
+              <w:rPr>
+                <w:sz w:val="22"/>
+                <w:szCs w:val="22"/>
+              </w:rPr>
+            </w:pPr>
+            <w:r>
+              <w:rPr>
+                <w:sz w:val="22"/>
+                <w:szCs w:val="22"/>
+              </w:rPr>
+              <w:t>n=10</w:t>
+            </w:r>
+          </w:p>
+        </w:tc>
+      </w:tr>
+    </w:tbl>
+    <w:p>
+      <w:pPr>
+        <w:pStyle w:val="ListParagraph"/>
+        <w:ind w:left="360"/>
+        <w:rPr>
+          <w:sz w:val="22"/>
+          <w:szCs w:val="22"/>
+        </w:rPr>
+      </w:pPr>
+      <w:r>
+        <w:rPr>
+          <w:sz w:val="22"/>
+          <w:szCs w:val="22"/>
+        </w:rPr>
+        <w:t xml:space="preserve">Min and max from Masteller 2025: 0.08 – 0.2 (from La Jara </w:t>
+      </w:r>
+      <w:r>
+        <w:rPr>
+          <w:i/>
+          <w:iCs/>
+          <w:sz w:val="22"/>
+          <w:szCs w:val="22"/>
+        </w:rPr>
+        <w:t xml:space="preserve">τ*c </w:t>
+      </w:r>
+      <w:r>
+        <w:rPr>
+          <w:sz w:val="22"/>
+          <w:szCs w:val="22"/>
+        </w:rPr>
+        <w:t>measurements)</w:t>
+      </w:r>
+    </w:p>
+    <w:p>
+      <w:pPr>
+        <w:pStyle w:val="ListParagraph"/>
+        <w:ind w:left="360"/>
+        <w:rPr>
+          <w:sz w:val="22"/>
+          <w:szCs w:val="22"/>
+        </w:rPr>
+      </w:pPr>
+      <w:r>
+        <w:rPr>
+          <w:sz w:val="22"/>
+          <w:szCs w:val="22"/>
+        </w:rPr>
+        <w:t xml:space="preserve">Best fit: </w:t>
+      </w:r>
+    </w:p>
+    <w:tbl>
+      <w:tblPr>
+        <w:tblStyle w:val="TableGrid"/>
+        <w:tblW w:w="0" w:type="auto"/>
+        <w:tblInd w:w="1746" w:type="dxa"/>
+        <w:tblLook w:val="04A0" w:firstRow="1" w:lastRow="0" w:firstColumn="1" w:lastColumn="0" w:noHBand="0" w:noVBand="1"/>
+      </w:tblPr>
+      <w:tblGrid>
+        <w:gridCol w:w="805"/>
+        <w:gridCol w:w="1260"/>
+      </w:tblGrid>
+      <w:tr>
+        <w:tc>
+          <w:tcPr>
+            <w:tcW w:w="805" w:type="dxa"/>
+          </w:tcPr>
+          <w:p>
+            <w:pPr>
+              <w:pStyle w:val="ListParagraph"/>
+              <w:ind w:left="0"/>
+              <w:jc w:val="center"/>
+              <w:rPr>
+                <w:sz w:val="22"/>
+                <w:szCs w:val="22"/>
+                <w:vertAlign w:val="subscript"/>
+              </w:rPr>
+            </w:pPr>
+            <w:r>
+              <w:rPr>
+                <w:sz w:val="22"/>
+                <w:szCs w:val="22"/>
+              </w:rPr>
+              <w:t>K</w:t>
+            </w:r>
+            <w:r>
+              <w:rPr>
+                <w:sz w:val="22"/>
+                <w:szCs w:val="22"/>
+                <w:vertAlign w:val="subscript"/>
+              </w:rPr>
+              <w:t>1</w:t>
+            </w:r>
+          </w:p>
+        </w:tc>
+        <w:tc>
+          <w:tcPr>
+            <w:tcW w:w="1260" w:type="dxa"/>
+          </w:tcPr>
+          <w:p>
+            <w:pPr>
+              <w:pStyle w:val="ListParagraph"/>
+              <w:ind w:left="0"/>
+              <w:jc w:val="center"/>
+              <w:rPr>
+                <w:sz w:val="22"/>
+                <w:szCs w:val="22"/>
+                <w:vertAlign w:val="superscript"/>
+              </w:rPr>
+            </w:pPr>
+            <w:r>
+              <w:rPr>
+                <w:sz w:val="22"/>
+                <w:szCs w:val="22"/>
+              </w:rPr>
+              <w:t>1</w:t>
+            </w:r>
+            <w:r>
+              <w:rPr>
+                <w:sz w:val="22"/>
+                <w:szCs w:val="22"/>
+              </w:rPr>
+              <w:t>.26</w:t>
+            </w:r>
+            <w:r>
+              <w:rPr>
+                <w:sz w:val="22"/>
+                <w:szCs w:val="22"/>
+              </w:rPr>
+              <w:t xml:space="preserve"> * 10</w:t>
+            </w:r>
+            <w:r>
+              <w:rPr>
+                <w:sz w:val="22"/>
+                <w:szCs w:val="22"/>
+                <w:vertAlign w:val="superscript"/>
+              </w:rPr>
+              <w:t>-6</w:t>
+            </w:r>
+          </w:p>
+        </w:tc>
+      </w:tr>
+      <w:tr>
+        <w:tc>
+          <w:tcPr>
+            <w:tcW w:w="805" w:type="dxa"/>
+          </w:tcPr>
+          <w:p>
+            <w:pPr>
+              <w:pStyle w:val="ListParagraph"/>
+              <w:ind w:left="0"/>
+              <w:jc w:val="center"/>
+              <w:rPr>
+                <w:sz w:val="22"/>
+                <w:szCs w:val="22"/>
+                <w:vertAlign w:val="subscript"/>
+              </w:rPr>
+            </w:pPr>
+            <w:r>
+              <w:rPr>
+                <w:sz w:val="22"/>
+                <w:szCs w:val="22"/>
+              </w:rPr>
+              <w:t>K</w:t>
+            </w:r>
+            <w:r>
+              <w:rPr>
+                <w:sz w:val="22"/>
+                <w:szCs w:val="22"/>
+                <w:vertAlign w:val="subscript"/>
+              </w:rPr>
+              <w:t>2</w:t>
+            </w:r>
+          </w:p>
+        </w:tc>
+        <w:tc>
+          <w:tcPr>
+            <w:tcW w:w="1260" w:type="dxa"/>
+          </w:tcPr>
+          <w:p>
+            <w:pPr>
+              <w:jc w:val="center"/>
+              <w:rPr>
+                <w:rFonts w:ascii="Aptos Narrow" w:hAnsi="Aptos Narrow"/>
+                <w:color w:val="000000"/>
+                <w:sz w:val="22"/>
+                <w:szCs w:val="22"/>
+              </w:rPr>
+            </w:pPr>
+            <w:r>
+              <w:rPr>
+                <w:sz w:val="22"/>
+                <w:szCs w:val="22"/>
+              </w:rPr>
+              <w:t>5.54</w:t>
+            </w:r>
+            <w:r>
+              <w:rPr>
+                <w:sz w:val="22"/>
+                <w:szCs w:val="22"/>
+              </w:rPr>
+              <w:t xml:space="preserve"> * 10</w:t>
+            </w:r>
+            <w:r>
+              <w:rPr>
+                <w:sz w:val="22"/>
+                <w:szCs w:val="22"/>
+                <w:vertAlign w:val="superscript"/>
+              </w:rPr>
+              <w:t>-</w:t>
+            </w:r>
+            <w:r>
+              <w:rPr>
+                <w:sz w:val="22"/>
+                <w:szCs w:val="22"/>
+                <w:vertAlign w:val="superscript"/>
+              </w:rPr>
+              <w:t>5</w:t>
+            </w:r>
+          </w:p>
+        </w:tc>
+      </w:tr>
+      <w:tr>
+        <w:tc>
+          <w:tcPr>
+            <w:tcW w:w="805" w:type="dxa"/>
+          </w:tcPr>
+          <w:p>
+            <w:pPr>
+              <w:pStyle w:val="ListParagraph"/>
+              <w:ind w:left="0"/>
+              <w:jc w:val="center"/>
+              <w:rPr>
+                <w:sz w:val="22"/>
+                <w:szCs w:val="22"/>
+              </w:rPr>
+            </w:pPr>
+            <w:r>
+              <w:rPr>
+                <w:rFonts w:ascii="Calibri" w:hAnsi="Calibri" w:cs="Calibri"/>
+                <w:sz w:val="22"/>
+                <w:szCs w:val="22"/>
+              </w:rPr>
+              <w:t>ε</w:t>
+            </w:r>
+          </w:p>
+        </w:tc>
+        <w:tc>
+          <w:tcPr>
+            <w:tcW w:w="1260" w:type="dxa"/>
+          </w:tcPr>
+          <w:p>
+            <w:pPr>
+              <w:pStyle w:val="ListParagraph"/>
+              <w:ind w:left="0"/>
+              <w:jc w:val="center"/>
+              <w:rPr>
+                <w:sz w:val="22"/>
+                <w:szCs w:val="22"/>
+              </w:rPr>
+            </w:pPr>
+            <w:r>
+              <w:rPr>
+                <w:sz w:val="22"/>
+                <w:szCs w:val="22"/>
+              </w:rPr>
+              <w:t>1</w:t>
+            </w:r>
+          </w:p>
+        </w:tc>
+      </w:tr>
+    </w:tbl>
+    <w:p>
+      <w:pPr>
+        <w:pStyle w:val="ListParagraph"/>
+        <w:ind w:left="360"/>
+        <w:rPr>
+          <w:sz w:val="22"/>
+          <w:szCs w:val="22"/>
+        </w:rPr>
+      </w:pPr>
+      <w:r>
+        <w:rPr>
+          <w:sz w:val="22"/>
+          <w:szCs w:val="22"/>
+        </w:rPr>
+        <w:t>MAE = 0.</w:t>
+      </w:r>
+      <w:r>
+        <w:rPr>
+          <w:sz w:val="22"/>
+          <w:szCs w:val="22"/>
+        </w:rPr>
+        <w:t>0095</w:t>
+      </w:r>
+    </w:p>
+    <w:p>
+      <w:pPr>
+        <w:pStyle w:val="ListParagraph"/>
+        <w:ind w:left="360"/>
+        <w:rPr>
+          <w:sz w:val="22"/>
+          <w:szCs w:val="22"/>
+        </w:rPr>
+      </w:pPr>
+      <w:r>
+        <w:rPr>
+          <w:sz w:val="22"/>
+          <w:szCs w:val="22"/>
+        </w:rPr>
+        <w:t xml:space="preserve">This is the smallest MAE so far! And the main issue is how it overpredicts that small storm at the end of September. Although it is convenient for the MAE calculation that it re-initializes, because it has more data points that fall within the 1:1 line. </w:t>
+      </w:r>
+    </w:p>
+    <w:p>
+      <w:pPr>
+        <w:pStyle w:val="ListParagraph"/>
+        <w:ind w:left="360"/>
+        <w:rPr>
+          <w:sz w:val="22"/>
+          <w:szCs w:val="22"/>
+        </w:rPr>
+      </w:pPr>
+    </w:p>
+    <w:p>
+      <w:pPr>
+        <w:pStyle w:val="ListParagraph"/>
+        <w:ind w:left="360"/>
+        <w:rPr>
+          <w:sz w:val="22"/>
+          <w:szCs w:val="22"/>
+        </w:rPr>
+      </w:pPr>
+      <w:r>
+        <w:rPr>
+          <w:sz w:val="22"/>
+          <w:szCs w:val="22"/>
+        </w:rPr>
+        <w:drawing>
+          <wp:inline distT="0" distB="0" distL="0" distR="0" wp14:anchorId="3FD1501C" wp14:editId="65AE3ACD">
+            <wp:extent cx="4301338" cy="1692044"/>
+            <wp:effectExtent l="0" t="0" r="4445" b="3810"/>
+            <wp:docPr id="671509708" name="Picture 1"/>
+            <wp:cNvGraphicFramePr>
+              <a:graphicFrameLocks xmlns:a="http://schemas.openxmlformats.org/drawingml/2006/main" noChangeAspect="1"/>
+            </wp:cNvGraphicFramePr>
+            <a:graphic xmlns:a="http://schemas.openxmlformats.org/drawingml/2006/main">
+              <a:graphicData uri="http://schemas.openxmlformats.org/drawingml/2006/picture">
+                <pic:pic xmlns:pic="http://schemas.openxmlformats.org/drawingml/2006/picture">
+                  <pic:nvPicPr>
+                    <pic:cNvPr id="671509708" name=""/>
+                    <pic:cNvPicPr/>
+                  </pic:nvPicPr>
+                  <pic:blipFill>
+                    <a:blip r:embed="rId15"/>
+                    <a:stretch>
+                      <a:fillRect/>
+                    </a:stretch>
+                  </pic:blipFill>
+                  <pic:spPr>
+                    <a:xfrm>
+                      <a:off x="0" y="0"/>
+                      <a:ext cx="4325069" cy="1701379"/>
+                    </a:xfrm>
+                    <a:prstGeom prst="rect">
+                      <a:avLst/>
+                    </a:prstGeom>
+                  </pic:spPr>
+                </pic:pic>
+              </a:graphicData>
+            </a:graphic>
+          </wp:inline>
+        </w:drawing>
+      </w:r>
+    </w:p>
+    <w:p>
+      <w:pPr>
+        <w:pStyle w:val="ListParagraph"/>
+        <w:ind w:left="360"/>
+        <w:rPr>
+          <w:sz w:val="22"/>
+          <w:szCs w:val="22"/>
+        </w:rPr>
+      </w:pPr>
+    </w:p>
+    <w:p>
+      <w:pPr>
+        <w:pStyle w:val="ListParagraph"/>
+        <w:ind w:left="360"/>
+        <w:rPr>
+          <w:sz w:val="22"/>
+          <w:szCs w:val="22"/>
+        </w:rPr>
+      </w:pPr>
+      <w:r>
+        <w:rPr>
+          <w:sz w:val="22"/>
+          <w:szCs w:val="22"/>
+        </w:rPr>
+        <w:t xml:space="preserve">When we </w:t>
+      </w:r>
+      <w:r>
+        <w:rPr>
+          <w:sz w:val="22"/>
+          <w:szCs w:val="22"/>
+        </w:rPr>
+        <w:t>compare it</w:t>
+      </w:r>
+      <w:r>
+        <w:rPr>
+          <w:sz w:val="22"/>
+          <w:szCs w:val="22"/>
+        </w:rPr>
+        <w:t xml:space="preserve"> to a constant value, using the model will improve MAE by 52.7%.</w:t>
+      </w:r>
+    </w:p>
+    <w:p>
+      <w:pPr>
+        <w:pStyle w:val="ListParagraph"/>
+        <w:ind w:left="360"/>
+        <w:rPr>
+          <w:sz w:val="22"/>
+          <w:szCs w:val="22"/>
+        </w:rPr>
+      </w:pPr>
+      <w:r>
+        <w:rPr>
+          <w:sz w:val="22"/>
+          <w:szCs w:val="22"/>
+        </w:rPr>
+        <w:drawing>
+          <wp:inline distT="0" distB="0" distL="0" distR="0" wp14:anchorId="46C58E37" wp14:editId="0EF8FE50">
+            <wp:extent cx="2424707" cy="2267712"/>
+            <wp:effectExtent l="0" t="0" r="0" b="0"/>
+            <wp:docPr id="6757409" name="Picture 1"/>
+            <wp:cNvGraphicFramePr>
+              <a:graphicFrameLocks xmlns:a="http://schemas.openxmlformats.org/drawingml/2006/main" noChangeAspect="1"/>
+            </wp:cNvGraphicFramePr>
+            <a:graphic xmlns:a="http://schemas.openxmlformats.org/drawingml/2006/main">
+              <a:graphicData uri="http://schemas.openxmlformats.org/drawingml/2006/picture">
+                <pic:pic xmlns:pic="http://schemas.openxmlformats.org/drawingml/2006/picture">
+                  <pic:nvPicPr>
+                    <pic:cNvPr id="6757409" name=""/>
+                    <pic:cNvPicPr/>
+                  </pic:nvPicPr>
+                  <pic:blipFill>
+                    <a:blip r:embed="rId16"/>
+                    <a:stretch>
+                      <a:fillRect/>
+                    </a:stretch>
+                  </pic:blipFill>
+                  <pic:spPr>
+                    <a:xfrm>
+                      <a:off x="0" y="0"/>
+                      <a:ext cx="2430093" cy="2272749"/>
+                    </a:xfrm>
+                    <a:prstGeom prst="rect">
+                      <a:avLst/>
+                    </a:prstGeom>
+                  </pic:spPr>
+                </pic:pic>
+              </a:graphicData>
+            </a:graphic>
+          </wp:inline>
+        </w:drawing>
+      </w:r>
+    </w:p>
+    <w:p>
+      <w:pPr>
+        <w:pStyle w:val="ListParagraph"/>
+        <w:ind w:left="360"/>
+        <w:rPr>
+          <w:sz w:val="22"/>
+          <w:szCs w:val="22"/>
+        </w:rPr>
+      </w:pPr>
+    </w:p>
+    <w:p>
+      <w:pPr>
+        <w:pStyle w:val="ListParagraph"/>
+        <w:ind w:left="360"/>
+        <w:rPr>
+          <w:sz w:val="22"/>
+          <w:szCs w:val="22"/>
+        </w:rPr>
+      </w:pPr>
+    </w:p>
+    <w:p>
+      <w:pPr>
+        <w:pStyle w:val="ListParagraph"/>
+        <w:ind w:left="360"/>
+        <w:rPr>
+          <w:sz w:val="22"/>
+          <w:szCs w:val="22"/>
+        </w:rPr>
+      </w:pPr>
+    </w:p>
+    <w:p>
+      <w:pPr>
+        <w:pStyle w:val="ListParagraph"/>
+        <w:ind w:left="360"/>
+        <w:rPr>
+          <w:sz w:val="22"/>
+          <w:szCs w:val="22"/>
+        </w:rPr>
+      </w:pPr>
+    </w:p>
+    <w:p>
+      <w:pPr>
+        <w:pStyle w:val="ListParagraph"/>
+        <w:ind w:left="360"/>
+        <w:rPr>
+          <w:sz w:val="22"/>
+          <w:szCs w:val="22"/>
+        </w:rPr>
+      </w:pPr>
+    </w:p>
+    <w:p>
+      <w:pPr>
+        <w:pStyle w:val="Heading3"/>
+        <w:numPr>
+          <w:ilvl w:val="1"/>
+          <w:numId w:val="6"/>
+        </w:numPr>
+        <w:rPr>
+          <w:sz w:val="24"/>
+          <w:szCs w:val="24"/>
+        </w:rPr>
+      </w:pPr>
+      <w:r>
+        <w:rPr>
+          <w:sz w:val="24"/>
+          <w:szCs w:val="24"/>
+        </w:rPr>
+        <w:lastRenderedPageBreak/>
+        <w:t xml:space="preserve">Assuming τ*c </w:t>
+      </w:r>
+      <w:r>
+        <w:rPr>
+          <w:sz w:val="24"/>
+          <w:szCs w:val="24"/>
+        </w:rPr>
+        <w:t>continuous</w:t>
+      </w:r>
+    </w:p>
+    <w:p>
+      <w:pPr>
+        <w:pStyle w:val="ListParagraph"/>
+        <w:ind w:left="360"/>
+        <w:rPr>
+          <w:sz w:val="22"/>
+          <w:szCs w:val="22"/>
+        </w:rPr>
+      </w:pPr>
+      <w:r>
+        <w:rPr>
+          <w:sz w:val="22"/>
+          <w:szCs w:val="22"/>
+        </w:rPr>
+        <w:t xml:space="preserve">Data ranges: </w:t>
+      </w:r>
+    </w:p>
+    <w:tbl>
+      <w:tblPr>
+        <w:tblStyle w:val="TableGrid"/>
+        <w:tblW w:w="0" w:type="auto"/>
+        <w:tblInd w:w="1597" w:type="dxa"/>
+        <w:tblLook w:val="04A0" w:firstRow="1" w:lastRow="0" w:firstColumn="1" w:lastColumn="0" w:noHBand="0" w:noVBand="1"/>
+      </w:tblPr>
+      <w:tblGrid>
+        <w:gridCol w:w="805"/>
+        <w:gridCol w:w="1260"/>
+        <w:gridCol w:w="720"/>
+      </w:tblGrid>
+      <w:tr>
+        <w:tc>
+          <w:tcPr>
+            <w:tcW w:w="805" w:type="dxa"/>
+          </w:tcPr>
+          <w:p>
+            <w:pPr>
+              <w:pStyle w:val="ListParagraph"/>
+              <w:ind w:left="0"/>
+              <w:jc w:val="center"/>
+              <w:rPr>
+                <w:sz w:val="22"/>
+                <w:szCs w:val="22"/>
+                <w:vertAlign w:val="subscript"/>
+              </w:rPr>
+            </w:pPr>
+            <w:r>
+              <w:rPr>
+                <w:sz w:val="22"/>
+                <w:szCs w:val="22"/>
+              </w:rPr>
+              <w:t>K</w:t>
+            </w:r>
+            <w:r>
+              <w:rPr>
+                <w:sz w:val="22"/>
+                <w:szCs w:val="22"/>
+                <w:vertAlign w:val="subscript"/>
+              </w:rPr>
+              <w:t>1</w:t>
+            </w:r>
+          </w:p>
+        </w:tc>
+        <w:tc>
+          <w:tcPr>
+            <w:tcW w:w="1260" w:type="dxa"/>
+          </w:tcPr>
+          <w:p>
+            <w:pPr>
+              <w:pStyle w:val="ListParagraph"/>
+              <w:ind w:left="0"/>
+              <w:rPr>
+                <w:sz w:val="22"/>
+                <w:szCs w:val="22"/>
+                <w:vertAlign w:val="superscript"/>
+              </w:rPr>
+            </w:pPr>
+            <w:r>
+              <w:rPr>
+                <w:sz w:val="22"/>
+                <w:szCs w:val="22"/>
+              </w:rPr>
+              <w:t>10</w:t>
+            </w:r>
+            <w:r>
+              <w:rPr>
+                <w:sz w:val="22"/>
+                <w:szCs w:val="22"/>
+                <w:vertAlign w:val="superscript"/>
+              </w:rPr>
+              <w:t>-6</w:t>
+            </w:r>
+            <w:r>
+              <w:rPr>
+                <w:sz w:val="22"/>
+                <w:szCs w:val="22"/>
+              </w:rPr>
+              <w:t xml:space="preserve"> – 10</w:t>
+            </w:r>
+            <w:r>
+              <w:rPr>
+                <w:sz w:val="22"/>
+                <w:szCs w:val="22"/>
+                <w:vertAlign w:val="superscript"/>
+              </w:rPr>
+              <w:t>-2</w:t>
+            </w:r>
+          </w:p>
+        </w:tc>
+        <w:tc>
+          <w:tcPr>
+            <w:tcW w:w="720" w:type="dxa"/>
+          </w:tcPr>
+          <w:p>
+            <w:pPr>
+              <w:pStyle w:val="ListParagraph"/>
+              <w:ind w:left="0"/>
+              <w:rPr>
+                <w:sz w:val="22"/>
+                <w:szCs w:val="22"/>
+              </w:rPr>
+            </w:pPr>
+            <w:r>
+              <w:rPr>
+                <w:sz w:val="22"/>
+                <w:szCs w:val="22"/>
+              </w:rPr>
+              <w:t>n=40</w:t>
+            </w:r>
+          </w:p>
+        </w:tc>
+      </w:tr>
+      <w:tr>
+        <w:tc>
+          <w:tcPr>
+            <w:tcW w:w="805" w:type="dxa"/>
+          </w:tcPr>
+          <w:p>
+            <w:pPr>
+              <w:pStyle w:val="ListParagraph"/>
+              <w:ind w:left="0"/>
+              <w:jc w:val="center"/>
+              <w:rPr>
+                <w:sz w:val="22"/>
+                <w:szCs w:val="22"/>
+                <w:vertAlign w:val="subscript"/>
+              </w:rPr>
+            </w:pPr>
+            <w:r>
+              <w:rPr>
+                <w:sz w:val="22"/>
+                <w:szCs w:val="22"/>
+              </w:rPr>
+              <w:t>K</w:t>
+            </w:r>
+            <w:r>
+              <w:rPr>
+                <w:sz w:val="22"/>
+                <w:szCs w:val="22"/>
+                <w:vertAlign w:val="subscript"/>
+              </w:rPr>
+              <w:t>2</w:t>
+            </w:r>
+          </w:p>
+        </w:tc>
+        <w:tc>
+          <w:tcPr>
+            <w:tcW w:w="1260" w:type="dxa"/>
+          </w:tcPr>
+          <w:p>
+            <w:pPr>
+              <w:pStyle w:val="ListParagraph"/>
+              <w:ind w:left="0"/>
+              <w:rPr>
+                <w:sz w:val="22"/>
+                <w:szCs w:val="22"/>
+              </w:rPr>
+            </w:pPr>
+            <w:r>
+              <w:rPr>
+                <w:sz w:val="22"/>
+                <w:szCs w:val="22"/>
+              </w:rPr>
+              <w:t>10</w:t>
+            </w:r>
+            <w:r>
+              <w:rPr>
+                <w:sz w:val="22"/>
+                <w:szCs w:val="22"/>
+                <w:vertAlign w:val="superscript"/>
+              </w:rPr>
+              <w:t>-6</w:t>
+            </w:r>
+            <w:r>
+              <w:rPr>
+                <w:sz w:val="22"/>
+                <w:szCs w:val="22"/>
+              </w:rPr>
+              <w:t xml:space="preserve"> – 10</w:t>
+            </w:r>
+            <w:r>
+              <w:rPr>
+                <w:sz w:val="22"/>
+                <w:szCs w:val="22"/>
+                <w:vertAlign w:val="superscript"/>
+              </w:rPr>
+              <w:t>-2</w:t>
+            </w:r>
+          </w:p>
+        </w:tc>
+        <w:tc>
+          <w:tcPr>
+            <w:tcW w:w="720" w:type="dxa"/>
+          </w:tcPr>
+          <w:p>
+            <w:pPr>
+              <w:pStyle w:val="ListParagraph"/>
+              <w:ind w:left="0"/>
+              <w:rPr>
+                <w:sz w:val="22"/>
+                <w:szCs w:val="22"/>
+              </w:rPr>
+            </w:pPr>
+            <w:r>
+              <w:rPr>
+                <w:sz w:val="22"/>
+                <w:szCs w:val="22"/>
+              </w:rPr>
+              <w:t>n=40</w:t>
+            </w:r>
+          </w:p>
+        </w:tc>
+      </w:tr>
+      <w:tr>
+        <w:tc>
+          <w:tcPr>
+            <w:tcW w:w="805" w:type="dxa"/>
+          </w:tcPr>
+          <w:p>
+            <w:pPr>
+              <w:pStyle w:val="ListParagraph"/>
+              <w:ind w:left="0"/>
+              <w:jc w:val="center"/>
+              <w:rPr>
+                <w:sz w:val="22"/>
+                <w:szCs w:val="22"/>
+              </w:rPr>
+            </w:pPr>
+            <w:r>
+              <w:rPr>
+                <w:rFonts w:ascii="Calibri" w:hAnsi="Calibri" w:cs="Calibri"/>
+                <w:sz w:val="22"/>
+                <w:szCs w:val="22"/>
+              </w:rPr>
+              <w:t>ε</w:t>
+            </w:r>
+          </w:p>
+        </w:tc>
+        <w:tc>
+          <w:tcPr>
+            <w:tcW w:w="1260" w:type="dxa"/>
+          </w:tcPr>
+          <w:p>
+            <w:pPr>
+              <w:pStyle w:val="ListParagraph"/>
+              <w:ind w:left="0"/>
+              <w:rPr>
+                <w:sz w:val="22"/>
+                <w:szCs w:val="22"/>
+              </w:rPr>
+            </w:pPr>
+            <w:r>
+              <w:rPr>
+                <w:sz w:val="22"/>
+                <w:szCs w:val="22"/>
+              </w:rPr>
+              <w:t>1-10</w:t>
+            </w:r>
+          </w:p>
+        </w:tc>
+        <w:tc>
+          <w:tcPr>
+            <w:tcW w:w="720" w:type="dxa"/>
+          </w:tcPr>
+          <w:p>
+            <w:pPr>
+              <w:pStyle w:val="ListParagraph"/>
+              <w:ind w:left="0"/>
+              <w:rPr>
+                <w:sz w:val="22"/>
+                <w:szCs w:val="22"/>
+              </w:rPr>
+            </w:pPr>
+            <w:r>
+              <w:rPr>
+                <w:sz w:val="22"/>
+                <w:szCs w:val="22"/>
+              </w:rPr>
+              <w:t>n=10</w:t>
+            </w:r>
+          </w:p>
+        </w:tc>
+      </w:tr>
+    </w:tbl>
+    <w:p>
+      <w:pPr>
+        <w:pStyle w:val="ListParagraph"/>
+        <w:ind w:left="360"/>
+        <w:rPr>
+          <w:sz w:val="22"/>
+          <w:szCs w:val="22"/>
+        </w:rPr>
+      </w:pPr>
+      <w:r>
+        <w:rPr>
+          <w:sz w:val="22"/>
+          <w:szCs w:val="22"/>
+        </w:rPr>
+        <w:t xml:space="preserve">Min and max from Masteller 2025: 0.08 – 0.2 (from La Jara </w:t>
+      </w:r>
+      <w:r>
+        <w:rPr>
+          <w:i/>
+          <w:iCs/>
+          <w:sz w:val="22"/>
+          <w:szCs w:val="22"/>
+        </w:rPr>
+        <w:t xml:space="preserve">τ*c </w:t>
+      </w:r>
+      <w:r>
+        <w:rPr>
+          <w:sz w:val="22"/>
+          <w:szCs w:val="22"/>
+        </w:rPr>
+        <w:t>measurements)</w:t>
+      </w:r>
+    </w:p>
+    <w:p>
+      <w:pPr>
+        <w:pStyle w:val="ListParagraph"/>
+        <w:ind w:left="360"/>
+        <w:rPr>
+          <w:sz w:val="22"/>
+          <w:szCs w:val="22"/>
+        </w:rPr>
+      </w:pPr>
+      <w:r>
+        <w:rPr>
+          <w:sz w:val="22"/>
+          <w:szCs w:val="22"/>
+        </w:rPr>
+        <w:t xml:space="preserve">Best fit: </w:t>
+      </w:r>
+    </w:p>
+    <w:tbl>
+      <w:tblPr>
+        <w:tblStyle w:val="TableGrid"/>
+        <w:tblW w:w="0" w:type="auto"/>
+        <w:tblInd w:w="1746" w:type="dxa"/>
+        <w:tblLook w:val="04A0" w:firstRow="1" w:lastRow="0" w:firstColumn="1" w:lastColumn="0" w:noHBand="0" w:noVBand="1"/>
+      </w:tblPr>
+      <w:tblGrid>
+        <w:gridCol w:w="805"/>
+        <w:gridCol w:w="1260"/>
+      </w:tblGrid>
+      <w:tr>
+        <w:tc>
+          <w:tcPr>
+            <w:tcW w:w="805" w:type="dxa"/>
+          </w:tcPr>
+          <w:p>
+            <w:pPr>
+              <w:pStyle w:val="ListParagraph"/>
+              <w:ind w:left="0"/>
+              <w:jc w:val="center"/>
+              <w:rPr>
+                <w:sz w:val="22"/>
+                <w:szCs w:val="22"/>
+                <w:vertAlign w:val="subscript"/>
+              </w:rPr>
+            </w:pPr>
+            <w:r>
+              <w:rPr>
+                <w:sz w:val="22"/>
+                <w:szCs w:val="22"/>
+              </w:rPr>
+              <w:t>K</w:t>
+            </w:r>
+            <w:r>
+              <w:rPr>
+                <w:sz w:val="22"/>
+                <w:szCs w:val="22"/>
+                <w:vertAlign w:val="subscript"/>
+              </w:rPr>
+              <w:t>1</w:t>
+            </w:r>
+          </w:p>
+        </w:tc>
+        <w:tc>
+          <w:tcPr>
+            <w:tcW w:w="1260" w:type="dxa"/>
+          </w:tcPr>
+          <w:p>
+            <w:pPr>
+              <w:pStyle w:val="ListParagraph"/>
+              <w:ind w:left="0"/>
+              <w:jc w:val="center"/>
+              <w:rPr>
+                <w:sz w:val="22"/>
+                <w:szCs w:val="22"/>
+                <w:vertAlign w:val="superscript"/>
+              </w:rPr>
+            </w:pPr>
+            <w:r>
+              <w:rPr>
+                <w:sz w:val="22"/>
+                <w:szCs w:val="22"/>
+              </w:rPr>
+              <w:t>3.26</w:t>
+            </w:r>
+            <w:r>
+              <w:rPr>
+                <w:sz w:val="22"/>
+                <w:szCs w:val="22"/>
+              </w:rPr>
+              <w:t xml:space="preserve"> * 10</w:t>
+            </w:r>
+            <w:r>
+              <w:rPr>
+                <w:sz w:val="22"/>
+                <w:szCs w:val="22"/>
+                <w:vertAlign w:val="superscript"/>
+              </w:rPr>
+              <w:t>-6</w:t>
+            </w:r>
+          </w:p>
+        </w:tc>
+      </w:tr>
+      <w:tr>
+        <w:tc>
+          <w:tcPr>
+            <w:tcW w:w="805" w:type="dxa"/>
+          </w:tcPr>
+          <w:p>
+            <w:pPr>
+              <w:pStyle w:val="ListParagraph"/>
+              <w:ind w:left="0"/>
+              <w:jc w:val="center"/>
+              <w:rPr>
+                <w:sz w:val="22"/>
+                <w:szCs w:val="22"/>
+                <w:vertAlign w:val="subscript"/>
+              </w:rPr>
+            </w:pPr>
+            <w:r>
+              <w:rPr>
+                <w:sz w:val="22"/>
+                <w:szCs w:val="22"/>
+              </w:rPr>
+              <w:t>K</w:t>
+            </w:r>
+            <w:r>
+              <w:rPr>
+                <w:sz w:val="22"/>
+                <w:szCs w:val="22"/>
+                <w:vertAlign w:val="subscript"/>
+              </w:rPr>
+              <w:t>2</w:t>
+            </w:r>
+          </w:p>
+        </w:tc>
+        <w:tc>
+          <w:tcPr>
+            <w:tcW w:w="1260" w:type="dxa"/>
+          </w:tcPr>
+          <w:p>
+            <w:pPr>
+              <w:jc w:val="center"/>
+              <w:rPr>
+                <w:rFonts w:ascii="Aptos Narrow" w:hAnsi="Aptos Narrow"/>
+                <w:color w:val="000000"/>
+                <w:sz w:val="22"/>
+                <w:szCs w:val="22"/>
+              </w:rPr>
+            </w:pPr>
+            <w:r>
+              <w:rPr>
+                <w:sz w:val="22"/>
+                <w:szCs w:val="22"/>
+              </w:rPr>
+              <w:t>4.64</w:t>
+            </w:r>
+            <w:r>
+              <w:rPr>
+                <w:sz w:val="22"/>
+                <w:szCs w:val="22"/>
+              </w:rPr>
+              <w:t xml:space="preserve"> * 10</w:t>
+            </w:r>
+            <w:r>
+              <w:rPr>
+                <w:sz w:val="22"/>
+                <w:szCs w:val="22"/>
+                <w:vertAlign w:val="superscript"/>
+              </w:rPr>
+              <w:t>-</w:t>
+            </w:r>
+            <w:r>
+              <w:rPr>
+                <w:sz w:val="22"/>
+                <w:szCs w:val="22"/>
+                <w:vertAlign w:val="superscript"/>
+              </w:rPr>
+              <w:t>4</w:t>
+            </w:r>
+          </w:p>
+        </w:tc>
+      </w:tr>
+      <w:tr>
+        <w:tc>
+          <w:tcPr>
+            <w:tcW w:w="805" w:type="dxa"/>
+          </w:tcPr>
+          <w:p>
+            <w:pPr>
+              <w:pStyle w:val="ListParagraph"/>
+              <w:ind w:left="0"/>
+              <w:jc w:val="center"/>
+              <w:rPr>
+                <w:sz w:val="22"/>
+                <w:szCs w:val="22"/>
+              </w:rPr>
+            </w:pPr>
+            <w:r>
+              <w:rPr>
+                <w:rFonts w:ascii="Calibri" w:hAnsi="Calibri" w:cs="Calibri"/>
+                <w:sz w:val="22"/>
+                <w:szCs w:val="22"/>
+              </w:rPr>
+              <w:t>ε</w:t>
+            </w:r>
+          </w:p>
+        </w:tc>
+        <w:tc>
+          <w:tcPr>
+            <w:tcW w:w="1260" w:type="dxa"/>
+          </w:tcPr>
+          <w:p>
+            <w:pPr>
+              <w:pStyle w:val="ListParagraph"/>
+              <w:ind w:left="0"/>
+              <w:jc w:val="center"/>
+              <w:rPr>
+                <w:sz w:val="22"/>
+                <w:szCs w:val="22"/>
+              </w:rPr>
+            </w:pPr>
+            <w:r>
+              <w:rPr>
+                <w:sz w:val="22"/>
+                <w:szCs w:val="22"/>
+              </w:rPr>
+              <w:t>1</w:t>
+            </w:r>
+          </w:p>
+        </w:tc>
+      </w:tr>
+    </w:tbl>
+    <w:p>
+      <w:pPr>
+        <w:pStyle w:val="ListParagraph"/>
+        <w:ind w:left="360"/>
+        <w:rPr>
+          <w:sz w:val="22"/>
+          <w:szCs w:val="22"/>
+        </w:rPr>
+      </w:pPr>
+      <w:r>
+        <w:rPr>
+          <w:sz w:val="22"/>
+          <w:szCs w:val="22"/>
+        </w:rPr>
+        <w:t>MAE = 0.</w:t>
+      </w:r>
+      <w:r>
+        <w:rPr>
+          <w:sz w:val="22"/>
+          <w:szCs w:val="22"/>
+        </w:rPr>
+        <w:t>0</w:t>
+      </w:r>
+      <w:r>
+        <w:rPr>
+          <w:sz w:val="22"/>
+          <w:szCs w:val="22"/>
+        </w:rPr>
+        <w:t>134</w:t>
+      </w:r>
+    </w:p>
+    <w:p>
+      <w:pPr>
+        <w:ind w:firstLine="360"/>
+      </w:pPr>
+      <w:r>
+        <w:drawing>
+          <wp:inline distT="0" distB="0" distL="0" distR="0" wp14:anchorId="34B2F60F" wp14:editId="740337C1">
+            <wp:extent cx="5135271" cy="2020093"/>
+            <wp:effectExtent l="0" t="0" r="8255" b="0"/>
+            <wp:docPr id="989222746" name="Picture 1"/>
+            <wp:cNvGraphicFramePr>
+              <a:graphicFrameLocks xmlns:a="http://schemas.openxmlformats.org/drawingml/2006/main" noChangeAspect="1"/>
+            </wp:cNvGraphicFramePr>
+            <a:graphic xmlns:a="http://schemas.openxmlformats.org/drawingml/2006/main">
+              <a:graphicData uri="http://schemas.openxmlformats.org/drawingml/2006/picture">
+                <pic:pic xmlns:pic="http://schemas.openxmlformats.org/drawingml/2006/picture">
+                  <pic:nvPicPr>
+                    <pic:cNvPr id="989222746" name=""/>
+                    <pic:cNvPicPr/>
+                  </pic:nvPicPr>
+                  <pic:blipFill>
+                    <a:blip r:embed="rId17"/>
+                    <a:stretch>
+                      <a:fillRect/>
+                    </a:stretch>
+                  </pic:blipFill>
+                  <pic:spPr>
+                    <a:xfrm>
+                      <a:off x="0" y="0"/>
+                      <a:ext cx="5152635" cy="2026924"/>
+                    </a:xfrm>
+                    <a:prstGeom prst="rect">
+                      <a:avLst/>
+                    </a:prstGeom>
+                  </pic:spPr>
+                </pic:pic>
+              </a:graphicData>
+            </a:graphic>
+          </wp:inline>
+        </w:drawing>
+      </w:r>
+    </w:p>
+    <w:p>
+      <w:pPr>
+        <w:ind w:firstLine="360"/>
+      </w:pPr>
+      <w:r>
+        <w:t>Model improvement over constant τ*c</w:t>
+      </w:r>
+      <w:r>
+        <w:t>: 33.3%</w:t>
+      </w:r>
+    </w:p>
+    <w:p>
+      <w:pPr>
+        <w:ind w:firstLine="360"/>
+      </w:pPr>
+      <w:r>
+        <w:drawing>
+          <wp:inline distT="0" distB="0" distL="0" distR="0" wp14:anchorId="73EEADD2" wp14:editId="709C2B53">
+            <wp:extent cx="2838298" cy="2654523"/>
+            <wp:effectExtent l="0" t="0" r="635" b="0"/>
+            <wp:docPr id="1079720135" name="Picture 1"/>
+            <wp:cNvGraphicFramePr>
+              <a:graphicFrameLocks xmlns:a="http://schemas.openxmlformats.org/drawingml/2006/main" noChangeAspect="1"/>
+            </wp:cNvGraphicFramePr>
+            <a:graphic xmlns:a="http://schemas.openxmlformats.org/drawingml/2006/main">
+              <a:graphicData uri="http://schemas.openxmlformats.org/drawingml/2006/picture">
+                <pic:pic xmlns:pic="http://schemas.openxmlformats.org/drawingml/2006/picture">
+                  <pic:nvPicPr>
+                    <pic:cNvPr id="1079720135" name=""/>
+                    <pic:cNvPicPr/>
+                  </pic:nvPicPr>
+                  <pic:blipFill>
+                    <a:blip r:embed="rId18"/>
+                    <a:stretch>
+                      <a:fillRect/>
+                    </a:stretch>
+                  </pic:blipFill>
+                  <pic:spPr>
+                    <a:xfrm>
+                      <a:off x="0" y="0"/>
+                      <a:ext cx="2853484" cy="2668725"/>
+                    </a:xfrm>
+                    <a:prstGeom prst="rect">
+                      <a:avLst/>
+                    </a:prstGeom>
+                  </pic:spPr>
+                </pic:pic>
+              </a:graphicData>
+            </a:graphic>
+          </wp:inline>
+        </w:drawing>
+      </w:r>
+    </w:p>
+    <w:p>
+      <w:pPr>
+        <w:pStyle w:val="Heading3"/>
+        <w:numPr>
+          <w:ilvl w:val="1"/>
+          <w:numId w:val="6"/>
+        </w:numPr>
+        <w:rPr>
+          <w:sz w:val="24"/>
+          <w:szCs w:val="24"/>
+        </w:rPr>
+      </w:pPr>
+      <w:r>
+        <w:rPr>
+          <w:sz w:val="24"/>
+          <w:szCs w:val="24"/>
+        </w:rPr>
+        <w:t xml:space="preserve">Assuming τ*c </w:t>
+      </w:r>
+      <w:r>
+        <w:rPr>
+          <w:sz w:val="24"/>
+          <w:szCs w:val="24"/>
+        </w:rPr>
+        <w:t>minimum</w:t>
+      </w:r>
+    </w:p>
+    <w:p>
+      <w:pPr>
+        <w:pStyle w:val="ListParagraph"/>
+        <w:ind w:left="360"/>
+        <w:rPr>
+          <w:sz w:val="22"/>
+          <w:szCs w:val="22"/>
+        </w:rPr>
+      </w:pPr>
+      <w:r>
+        <w:rPr>
+          <w:sz w:val="22"/>
+          <w:szCs w:val="22"/>
+        </w:rPr>
+        <w:t xml:space="preserve">Data ranges: </w:t>
+      </w:r>
+    </w:p>
+    <w:tbl>
+      <w:tblPr>
+        <w:tblStyle w:val="TableGrid"/>
+        <w:tblW w:w="0" w:type="auto"/>
+        <w:tblInd w:w="1597" w:type="dxa"/>
+        <w:tblLook w:val="04A0" w:firstRow="1" w:lastRow="0" w:firstColumn="1" w:lastColumn="0" w:noHBand="0" w:noVBand="1"/>
+      </w:tblPr>
+      <w:tblGrid>
+        <w:gridCol w:w="805"/>
+        <w:gridCol w:w="1260"/>
+        <w:gridCol w:w="720"/>
+      </w:tblGrid>
+      <w:tr>
+        <w:tc>
+          <w:tcPr>
+            <w:tcW w:w="805" w:type="dxa"/>
+          </w:tcPr>
+          <w:p>
+            <w:pPr>
+              <w:pStyle w:val="ListParagraph"/>
+              <w:ind w:left="0"/>
+              <w:jc w:val="center"/>
+              <w:rPr>
+                <w:sz w:val="22"/>
+                <w:szCs w:val="22"/>
+                <w:vertAlign w:val="subscript"/>
+              </w:rPr>
+            </w:pPr>
+            <w:r>
+              <w:rPr>
+                <w:sz w:val="22"/>
+                <w:szCs w:val="22"/>
+              </w:rPr>
+              <w:t>K</w:t>
+            </w:r>
+            <w:r>
+              <w:rPr>
+                <w:sz w:val="22"/>
+                <w:szCs w:val="22"/>
+                <w:vertAlign w:val="subscript"/>
+              </w:rPr>
+              <w:t>1</w:t>
+            </w:r>
+          </w:p>
+        </w:tc>
+        <w:tc>
+          <w:tcPr>
+            <w:tcW w:w="1260" w:type="dxa"/>
+          </w:tcPr>
+          <w:p>
+            <w:pPr>
+              <w:pStyle w:val="ListParagraph"/>
+              <w:ind w:left="0"/>
+              <w:rPr>
+                <w:sz w:val="22"/>
+                <w:szCs w:val="22"/>
+                <w:vertAlign w:val="superscript"/>
+              </w:rPr>
+            </w:pPr>
+            <w:r>
+              <w:rPr>
+                <w:sz w:val="22"/>
+                <w:szCs w:val="22"/>
+              </w:rPr>
+              <w:t>10</w:t>
+            </w:r>
+            <w:r>
+              <w:rPr>
+                <w:sz w:val="22"/>
+                <w:szCs w:val="22"/>
+                <w:vertAlign w:val="superscript"/>
+              </w:rPr>
+              <w:t>-6</w:t>
+            </w:r>
+            <w:r>
+              <w:rPr>
+                <w:sz w:val="22"/>
+                <w:szCs w:val="22"/>
+              </w:rPr>
+              <w:t xml:space="preserve"> – 10</w:t>
+            </w:r>
+            <w:r>
+              <w:rPr>
+                <w:sz w:val="22"/>
+                <w:szCs w:val="22"/>
+                <w:vertAlign w:val="superscript"/>
+              </w:rPr>
+              <w:t>-2</w:t>
+            </w:r>
+          </w:p>
+        </w:tc>
+        <w:tc>
+          <w:tcPr>
+            <w:tcW w:w="720" w:type="dxa"/>
+          </w:tcPr>
+          <w:p>
+            <w:pPr>
+              <w:pStyle w:val="ListParagraph"/>
+              <w:ind w:left="0"/>
+              <w:rPr>
+                <w:sz w:val="22"/>
+                <w:szCs w:val="22"/>
+              </w:rPr>
+            </w:pPr>
+            <w:r>
+              <w:rPr>
+                <w:sz w:val="22"/>
+                <w:szCs w:val="22"/>
+              </w:rPr>
+              <w:t>n=40</w:t>
+            </w:r>
+          </w:p>
+        </w:tc>
+      </w:tr>
+      <w:tr>
+        <w:tc>
+          <w:tcPr>
+            <w:tcW w:w="805" w:type="dxa"/>
+          </w:tcPr>
+          <w:p>
+            <w:pPr>
+              <w:pStyle w:val="ListParagraph"/>
+              <w:ind w:left="0"/>
+              <w:jc w:val="center"/>
+              <w:rPr>
+                <w:sz w:val="22"/>
+                <w:szCs w:val="22"/>
+                <w:vertAlign w:val="subscript"/>
+              </w:rPr>
+            </w:pPr>
+            <w:r>
+              <w:rPr>
+                <w:sz w:val="22"/>
+                <w:szCs w:val="22"/>
+              </w:rPr>
+              <w:t>K</w:t>
+            </w:r>
+            <w:r>
+              <w:rPr>
+                <w:sz w:val="22"/>
+                <w:szCs w:val="22"/>
+                <w:vertAlign w:val="subscript"/>
+              </w:rPr>
+              <w:t>2</w:t>
+            </w:r>
+          </w:p>
+        </w:tc>
+        <w:tc>
+          <w:tcPr>
+            <w:tcW w:w="1260" w:type="dxa"/>
+          </w:tcPr>
+          <w:p>
+            <w:pPr>
+              <w:pStyle w:val="ListParagraph"/>
+              <w:ind w:left="0"/>
+              <w:rPr>
+                <w:sz w:val="22"/>
+                <w:szCs w:val="22"/>
+              </w:rPr>
+            </w:pPr>
+            <w:r>
+              <w:rPr>
+                <w:sz w:val="22"/>
+                <w:szCs w:val="22"/>
+              </w:rPr>
+              <w:t>10</w:t>
+            </w:r>
+            <w:r>
+              <w:rPr>
+                <w:sz w:val="22"/>
+                <w:szCs w:val="22"/>
+                <w:vertAlign w:val="superscript"/>
+              </w:rPr>
+              <w:t>-6</w:t>
+            </w:r>
+            <w:r>
+              <w:rPr>
+                <w:sz w:val="22"/>
+                <w:szCs w:val="22"/>
+              </w:rPr>
+              <w:t xml:space="preserve"> – 10</w:t>
+            </w:r>
+            <w:r>
+              <w:rPr>
+                <w:sz w:val="22"/>
+                <w:szCs w:val="22"/>
+                <w:vertAlign w:val="superscript"/>
+              </w:rPr>
+              <w:t>-2</w:t>
+            </w:r>
+          </w:p>
+        </w:tc>
+        <w:tc>
+          <w:tcPr>
+            <w:tcW w:w="720" w:type="dxa"/>
+          </w:tcPr>
+          <w:p>
+            <w:pPr>
+              <w:pStyle w:val="ListParagraph"/>
+              <w:ind w:left="0"/>
+              <w:rPr>
+                <w:sz w:val="22"/>
+                <w:szCs w:val="22"/>
+              </w:rPr>
+            </w:pPr>
+            <w:r>
+              <w:rPr>
+                <w:sz w:val="22"/>
+                <w:szCs w:val="22"/>
+              </w:rPr>
+              <w:t>n=40</w:t>
+            </w:r>
+          </w:p>
+        </w:tc>
+      </w:tr>
+      <w:tr>
+        <w:tc>
+          <w:tcPr>
+            <w:tcW w:w="805" w:type="dxa"/>
+          </w:tcPr>
+          <w:p>
+            <w:pPr>
+              <w:pStyle w:val="ListParagraph"/>
+              <w:ind w:left="0"/>
+              <w:jc w:val="center"/>
+              <w:rPr>
+                <w:sz w:val="22"/>
+                <w:szCs w:val="22"/>
+              </w:rPr>
+            </w:pPr>
+            <w:r>
+              <w:rPr>
+                <w:rFonts w:ascii="Calibri" w:hAnsi="Calibri" w:cs="Calibri"/>
+                <w:sz w:val="22"/>
+                <w:szCs w:val="22"/>
+              </w:rPr>
+              <w:t>ε</w:t>
+            </w:r>
+          </w:p>
+        </w:tc>
+        <w:tc>
+          <w:tcPr>
+            <w:tcW w:w="1260" w:type="dxa"/>
+          </w:tcPr>
+          <w:p>
+            <w:pPr>
+              <w:pStyle w:val="ListParagraph"/>
+              <w:ind w:left="0"/>
+              <w:rPr>
+                <w:sz w:val="22"/>
+                <w:szCs w:val="22"/>
+              </w:rPr>
+            </w:pPr>
+            <w:r>
+              <w:rPr>
+                <w:sz w:val="22"/>
+                <w:szCs w:val="22"/>
+              </w:rPr>
+              <w:t>1-10</w:t>
+            </w:r>
+          </w:p>
+        </w:tc>
+        <w:tc>
+          <w:tcPr>
+            <w:tcW w:w="720" w:type="dxa"/>
+          </w:tcPr>
+          <w:p>
+            <w:pPr>
+              <w:pStyle w:val="ListParagraph"/>
+              <w:ind w:left="0"/>
+              <w:rPr>
+                <w:sz w:val="22"/>
+                <w:szCs w:val="22"/>
+              </w:rPr>
+            </w:pPr>
+            <w:r>
+              <w:rPr>
+                <w:sz w:val="22"/>
+                <w:szCs w:val="22"/>
+              </w:rPr>
+              <w:t>n=10</w:t>
+            </w:r>
+          </w:p>
+        </w:tc>
+      </w:tr>
+    </w:tbl>
+    <w:p>
+      <w:pPr>
+        <w:pStyle w:val="ListParagraph"/>
+        <w:ind w:left="360"/>
+        <w:rPr>
+          <w:sz w:val="22"/>
+          <w:szCs w:val="22"/>
+        </w:rPr>
+      </w:pPr>
+      <w:r>
+        <w:rPr>
+          <w:sz w:val="22"/>
+          <w:szCs w:val="22"/>
+        </w:rPr>
+        <w:t xml:space="preserve">Min and max from Masteller 2025: 0.08 – 0.2 (from La Jara </w:t>
+      </w:r>
+      <w:r>
+        <w:rPr>
+          <w:i/>
+          <w:iCs/>
+          <w:sz w:val="22"/>
+          <w:szCs w:val="22"/>
+        </w:rPr>
+        <w:t xml:space="preserve">τ*c </w:t>
+      </w:r>
+      <w:r>
+        <w:rPr>
+          <w:sz w:val="22"/>
+          <w:szCs w:val="22"/>
+        </w:rPr>
+        <w:t>measurements)</w:t>
+      </w:r>
+    </w:p>
+    <w:p>
+      <w:pPr>
+        <w:pStyle w:val="ListParagraph"/>
+        <w:ind w:left="360"/>
+        <w:rPr>
+          <w:sz w:val="22"/>
+          <w:szCs w:val="22"/>
+        </w:rPr>
+      </w:pPr>
+      <w:r>
+        <w:rPr>
+          <w:sz w:val="22"/>
+          <w:szCs w:val="22"/>
+        </w:rPr>
+        <w:t xml:space="preserve">Best fit: </w:t>
+      </w:r>
+    </w:p>
+    <w:tbl>
+      <w:tblPr>
+        <w:tblStyle w:val="TableGrid"/>
+        <w:tblW w:w="0" w:type="auto"/>
+        <w:tblInd w:w="1746" w:type="dxa"/>
+        <w:tblLook w:val="04A0" w:firstRow="1" w:lastRow="0" w:firstColumn="1" w:lastColumn="0" w:noHBand="0" w:noVBand="1"/>
+      </w:tblPr>
+      <w:tblGrid>
+        <w:gridCol w:w="805"/>
+        <w:gridCol w:w="1260"/>
+      </w:tblGrid>
+      <w:tr>
+        <w:tc>
+          <w:tcPr>
+            <w:tcW w:w="805" w:type="dxa"/>
+          </w:tcPr>
+          <w:p>
+            <w:pPr>
+              <w:pStyle w:val="ListParagraph"/>
+              <w:ind w:left="0"/>
+              <w:jc w:val="center"/>
+              <w:rPr>
+                <w:sz w:val="22"/>
+                <w:szCs w:val="22"/>
+                <w:vertAlign w:val="subscript"/>
+              </w:rPr>
+            </w:pPr>
+            <w:r>
+              <w:rPr>
+                <w:sz w:val="22"/>
+                <w:szCs w:val="22"/>
+              </w:rPr>
+              <w:t>K</w:t>
+            </w:r>
+            <w:r>
+              <w:rPr>
+                <w:sz w:val="22"/>
+                <w:szCs w:val="22"/>
+                <w:vertAlign w:val="subscript"/>
+              </w:rPr>
+              <w:t>1</w:t>
+            </w:r>
+          </w:p>
+        </w:tc>
+        <w:tc>
+          <w:tcPr>
+            <w:tcW w:w="1260" w:type="dxa"/>
+          </w:tcPr>
+          <w:p>
+            <w:pPr>
+              <w:pStyle w:val="ListParagraph"/>
+              <w:ind w:left="0"/>
+              <w:jc w:val="center"/>
+              <w:rPr>
+                <w:sz w:val="22"/>
+                <w:szCs w:val="22"/>
+                <w:vertAlign w:val="superscript"/>
+              </w:rPr>
+            </w:pPr>
+            <w:r>
+              <w:rPr>
+                <w:sz w:val="22"/>
+                <w:szCs w:val="22"/>
+              </w:rPr>
+              <w:t>1</w:t>
+            </w:r>
+            <w:r>
+              <w:rPr>
+                <w:sz w:val="22"/>
+                <w:szCs w:val="22"/>
+              </w:rPr>
+              <w:t xml:space="preserve"> * 10</w:t>
+            </w:r>
+            <w:r>
+              <w:rPr>
+                <w:sz w:val="22"/>
+                <w:szCs w:val="22"/>
+                <w:vertAlign w:val="superscript"/>
+              </w:rPr>
+              <w:t>-6</w:t>
+            </w:r>
+          </w:p>
+        </w:tc>
+      </w:tr>
+      <w:tr>
+        <w:tc>
+          <w:tcPr>
+            <w:tcW w:w="805" w:type="dxa"/>
+          </w:tcPr>
+          <w:p>
+            <w:pPr>
+              <w:pStyle w:val="ListParagraph"/>
+              <w:ind w:left="0"/>
+              <w:jc w:val="center"/>
+              <w:rPr>
+                <w:sz w:val="22"/>
+                <w:szCs w:val="22"/>
+                <w:vertAlign w:val="subscript"/>
+              </w:rPr>
+            </w:pPr>
+            <w:r>
+              <w:rPr>
+                <w:sz w:val="22"/>
+                <w:szCs w:val="22"/>
+              </w:rPr>
+              <w:lastRenderedPageBreak/>
+              <w:t>K</w:t>
+            </w:r>
+            <w:r>
+              <w:rPr>
+                <w:sz w:val="22"/>
+                <w:szCs w:val="22"/>
+                <w:vertAlign w:val="subscript"/>
+              </w:rPr>
+              <w:t>2</w:t>
+            </w:r>
+          </w:p>
+        </w:tc>
+        <w:tc>
+          <w:tcPr>
+            <w:tcW w:w="1260" w:type="dxa"/>
+          </w:tcPr>
+          <w:p>
+            <w:pPr>
+              <w:jc w:val="center"/>
+              <w:rPr>
+                <w:rFonts w:ascii="Aptos Narrow" w:hAnsi="Aptos Narrow"/>
+                <w:color w:val="000000"/>
+                <w:sz w:val="22"/>
+                <w:szCs w:val="22"/>
+              </w:rPr>
+            </w:pPr>
+            <w:r>
+              <w:rPr>
+                <w:rFonts w:ascii="Aptos Narrow" w:hAnsi="Aptos Narrow"/>
+                <w:color w:val="000000"/>
+                <w:sz w:val="22"/>
+                <w:szCs w:val="22"/>
+              </w:rPr>
+              <w:t>0.01</w:t>
+            </w:r>
+          </w:p>
+        </w:tc>
+      </w:tr>
+      <w:tr>
+        <w:tc>
+          <w:tcPr>
+            <w:tcW w:w="805" w:type="dxa"/>
+          </w:tcPr>
+          <w:p>
+            <w:pPr>
+              <w:pStyle w:val="ListParagraph"/>
+              <w:ind w:left="0"/>
+              <w:jc w:val="center"/>
+              <w:rPr>
+                <w:sz w:val="22"/>
+                <w:szCs w:val="22"/>
+              </w:rPr>
+            </w:pPr>
+            <w:r>
+              <w:rPr>
+                <w:rFonts w:ascii="Calibri" w:hAnsi="Calibri" w:cs="Calibri"/>
+                <w:sz w:val="22"/>
+                <w:szCs w:val="22"/>
+              </w:rPr>
+              <w:t>ε</w:t>
+            </w:r>
+          </w:p>
+        </w:tc>
+        <w:tc>
+          <w:tcPr>
+            <w:tcW w:w="1260" w:type="dxa"/>
+          </w:tcPr>
+          <w:p>
+            <w:pPr>
+              <w:pStyle w:val="ListParagraph"/>
+              <w:ind w:left="0"/>
+              <w:jc w:val="center"/>
+              <w:rPr>
+                <w:sz w:val="22"/>
+                <w:szCs w:val="22"/>
+              </w:rPr>
+            </w:pPr>
+            <w:r>
+              <w:rPr>
+                <w:sz w:val="22"/>
+                <w:szCs w:val="22"/>
+              </w:rPr>
+              <w:t>1</w:t>
+            </w:r>
+            <w:r>
+              <w:rPr>
+                <w:sz w:val="22"/>
+                <w:szCs w:val="22"/>
+              </w:rPr>
+              <w:t>0</w:t>
+            </w:r>
+          </w:p>
+        </w:tc>
+      </w:tr>
+    </w:tbl>
+    <w:p>
+      <w:pPr>
+        <w:pStyle w:val="ListParagraph"/>
+        <w:ind w:left="360"/>
+        <w:rPr>
+          <w:sz w:val="22"/>
+          <w:szCs w:val="22"/>
+        </w:rPr>
+      </w:pPr>
+      <w:r>
+        <w:rPr>
+          <w:sz w:val="22"/>
+          <w:szCs w:val="22"/>
+        </w:rPr>
+        <w:t xml:space="preserve">MAE = </w:t>
+      </w:r>
+      <w:r>
+        <w:rPr>
+          <w:sz w:val="22"/>
+          <w:szCs w:val="22"/>
+        </w:rPr>
+        <w:t>0.019</w:t>
+      </w:r>
+    </w:p>
+    <w:p>
+      <w:pPr>
+        <w:pStyle w:val="ListParagraph"/>
+        <w:ind w:left="360"/>
+        <w:rPr>
+          <w:sz w:val="22"/>
+          <w:szCs w:val="22"/>
+        </w:rPr>
+      </w:pPr>
+    </w:p>
+    <w:p>
+      <w:pPr>
+        <w:pStyle w:val="ListParagraph"/>
+        <w:ind w:left="360"/>
+        <w:rPr>
+          <w:sz w:val="22"/>
+          <w:szCs w:val="22"/>
+        </w:rPr>
+      </w:pPr>
+      <w:r>
+        <w:rPr>
+          <w:sz w:val="22"/>
+          <w:szCs w:val="22"/>
+        </w:rPr>
+        <w:drawing>
+          <wp:inline distT="0" distB="0" distL="0" distR="0" wp14:anchorId="77E67E9C" wp14:editId="77ECFEB5">
+            <wp:extent cx="5135271" cy="2036552"/>
+            <wp:effectExtent l="0" t="0" r="8255" b="1905"/>
+            <wp:docPr id="692668796" name="Picture 1"/>
+            <wp:cNvGraphicFramePr>
+              <a:graphicFrameLocks xmlns:a="http://schemas.openxmlformats.org/drawingml/2006/main" noChangeAspect="1"/>
+            </wp:cNvGraphicFramePr>
+            <a:graphic xmlns:a="http://schemas.openxmlformats.org/drawingml/2006/main">
+              <a:graphicData uri="http://schemas.openxmlformats.org/drawingml/2006/picture">
+                <pic:pic xmlns:pic="http://schemas.openxmlformats.org/drawingml/2006/picture">
+                  <pic:nvPicPr>
+                    <pic:cNvPr id="692668796" name=""/>
+                    <pic:cNvPicPr/>
+                  </pic:nvPicPr>
+                  <pic:blipFill>
+                    <a:blip r:embed="rId19"/>
+                    <a:stretch>
+                      <a:fillRect/>
+                    </a:stretch>
+                  </pic:blipFill>
+                  <pic:spPr>
+                    <a:xfrm>
+                      <a:off x="0" y="0"/>
+                      <a:ext cx="5138451" cy="2037813"/>
+                    </a:xfrm>
+                    <a:prstGeom prst="rect">
+                      <a:avLst/>
+                    </a:prstGeom>
+                  </pic:spPr>
+                </pic:pic>
+              </a:graphicData>
+            </a:graphic>
+          </wp:inline>
+        </w:drawing>
+      </w:r>
+    </w:p>
+    <w:p/>
+    <w:p/>
+    <w:p/>
+    <w:p/>
+    <w:p/>
+    <w:p/>
     <w:p/>
     <w:p>
       <w:pPr>
@@ -5768,6 +7708,119 @@
       <w:lvlJc w:val="left"/>
       <w:pPr>
         <w:ind w:left="7560" w:hanging="1800"/>
+      </w:pPr>
+      <w:rPr>
+        <w:rFonts w:hint="default"/>
+      </w:rPr>
+    </w:lvl>
+  </w:abstractNum>
+  <w:abstractNum w:abstractNumId="5" w15:restartNumberingAfterBreak="0">
+    <w:nsid w:val="4B912B6C"/>
+    <w:multiLevelType w:val="multilevel"/>
+    <w:tmpl w:val="1BD637FA"/>
+    <w:lvl w:ilvl="0">
+      <w:start w:val="4"/>
+      <w:numFmt w:val="decimal"/>
+      <w:lvlText w:val="%1."/>
+      <w:lvlJc w:val="left"/>
+      <w:pPr>
+        <w:ind w:left="360" w:hanging="360"/>
+      </w:pPr>
+      <w:rPr>
+        <w:rFonts w:hint="default"/>
+      </w:rPr>
+    </w:lvl>
+    <w:lvl w:ilvl="1">
+      <w:start w:val="1"/>
+      <w:numFmt w:val="decimal"/>
+      <w:lvlText w:val="%1.%2)"/>
+      <w:lvlJc w:val="left"/>
+      <w:pPr>
+        <w:ind w:left="720" w:hanging="720"/>
+      </w:pPr>
+      <w:rPr>
+        <w:rFonts w:hint="default"/>
+      </w:rPr>
+    </w:lvl>
+    <w:lvl w:ilvl="2">
+      <w:start w:val="1"/>
+      <w:numFmt w:val="decimal"/>
+      <w:lvlText w:val="%1.%2)%3."/>
+      <w:lvlJc w:val="left"/>
+      <w:pPr>
+        <w:ind w:left="720" w:hanging="720"/>
+      </w:pPr>
+      <w:rPr>
+        <w:rFonts w:hint="default"/>
+      </w:rPr>
+    </w:lvl>
+    <w:lvl w:ilvl="3">
+      <w:start w:val="1"/>
+      <w:numFmt w:val="decimal"/>
+      <w:lvlText w:val="%1.%2)%3.%4."/>
+      <w:lvlJc w:val="left"/>
+      <w:pPr>
+        <w:ind w:left="1080" w:hanging="1080"/>
+      </w:pPr>
+      <w:rPr>
+        <w:rFonts w:hint="default"/>
+      </w:rPr>
+    </w:lvl>
+    <w:lvl w:ilvl="4">
+      <w:start w:val="1"/>
+      <w:numFmt w:val="decimal"/>
+      <w:lvlText w:val="%1.%2)%3.%4.%5."/>
+      <w:lvlJc w:val="left"/>
+      <w:pPr>
+        <w:ind w:left="1080" w:hanging="1080"/>
+      </w:pPr>
+      <w:rPr>
+        <w:rFonts w:hint="default"/>
+      </w:rPr>
+    </w:lvl>
+    <w:lvl w:ilvl="5">
+      <w:start w:val="1"/>
+      <w:numFmt w:val="decimal"/>
+      <w:lvlText w:val="%1.%2)%3.%4.%5.%6."/>
+      <w:lvlJc w:val="left"/>
+      <w:pPr>
+        <w:ind w:left="1440" w:hanging="1440"/>
+      </w:pPr>
+      <w:rPr>
+        <w:rFonts w:hint="default"/>
+      </w:rPr>
+    </w:lvl>
+    <w:lvl w:ilvl="6">
+      <w:start w:val="1"/>
+      <w:numFmt w:val="decimal"/>
+      <w:lvlText w:val="%1.%2)%3.%4.%5.%6.%7."/>
+      <w:lvlJc w:val="left"/>
+      <w:pPr>
+        <w:ind w:left="1440" w:hanging="1440"/>
+      </w:pPr>
+      <w:rPr>
+        <w:rFonts w:hint="default"/>
+      </w:rPr>
+    </w:lvl>
+    <w:lvl w:ilvl="7">
+      <w:start w:val="1"/>
+      <w:numFmt w:val="decimal"/>
+      <w:lvlText w:val="%1.%2)%3.%4.%5.%6.%7.%8."/>
+      <w:lvlJc w:val="left"/>
+      <w:pPr>
+        <w:ind w:left="1800" w:hanging="1800"/>
+      </w:pPr>
+      <w:rPr>
+        <w:rFonts w:hint="default"/>
+      </w:rPr>
+    </w:lvl>
+    <w:lvl w:ilvl="8">
+      <w:start w:val="1"/>
+      <w:numFmt w:val="decimal"/>
+      <w:lvlText w:val="%1.%2)%3.%4.%5.%6.%7.%8.%9."/>
+      <w:lvlJc w:val="left"/>
+      <w:pPr>
+        <w:ind w:left="1800" w:hanging="1800"/>
       </w:pPr>
       <w:rPr>
         <w:rFonts w:hint="default"/>
@@ -5788,6 +7841,9 @@
   </w:num>
   <w:num w:numId="5" w16cid:durableId="1504857847">
     <w:abstractNumId w:val="3"/>
+  </w:num>
+  <w:num w:numId="6" w16cid:durableId="1800175335">
+    <w:abstractNumId w:val="5"/>
   </w:num>
 </w:numbering>
 </file>

</xml_diff>

<commit_message>
independent year masteller calibration (2023)
</commit_message>
<xml_diff>
--- a/antecedent_conditions/masteller_model/masteller_parameter_calibration_summary.docx
+++ b/antecedent_conditions/masteller_model/masteller_parameter_calibration_summary.docx
@@ -806,7 +806,7 @@
           <w:szCs w:val="22"/>
         </w:rPr>
         <w:drawing>
-          <wp:inline distT="0" distB="0" distL="0" distR="0" wp14:anchorId="7BE4C8E7" wp14:editId="0A2C8C82">
+          <wp:inline distT="0" distB="0" distL="0" distR="0" wp14:anchorId="7BE4C8E7" wp14:editId="5C1D7244">
             <wp:extent cx="3979316" cy="1563394"/>
             <wp:effectExtent l="0" t="0" r="2540" b="0"/>
             <wp:docPr id="1703571791" name="Picture 2"/>
@@ -1514,7 +1514,7 @@
         </w:rPr>
         <w:lastRenderedPageBreak/>
         <w:drawing>
-          <wp:inline distT="0" distB="0" distL="0" distR="0" wp14:anchorId="679B8F3B" wp14:editId="5D290834">
+          <wp:inline distT="0" distB="0" distL="0" distR="0" wp14:anchorId="679B8F3B" wp14:editId="11649E66">
             <wp:extent cx="3825697" cy="1503040"/>
             <wp:effectExtent l="0" t="0" r="3810" b="2540"/>
             <wp:docPr id="704999060" name="Picture 3"/>
@@ -2198,7 +2198,7 @@
           <w:szCs w:val="22"/>
         </w:rPr>
         <w:drawing>
-          <wp:inline distT="0" distB="0" distL="0" distR="0" wp14:anchorId="55FA6CA9" wp14:editId="0F196AF6">
+          <wp:inline distT="0" distB="0" distL="0" distR="0" wp14:anchorId="55FA6CA9" wp14:editId="22BEEBB1">
             <wp:extent cx="3984557" cy="1565453"/>
             <wp:effectExtent l="0" t="0" r="0" b="0"/>
             <wp:docPr id="462658038" name="Picture 4"/>
@@ -3104,7 +3104,7 @@
           <w:szCs w:val="22"/>
         </w:rPr>
         <w:drawing>
-          <wp:inline distT="0" distB="0" distL="0" distR="0" wp14:anchorId="567F008F" wp14:editId="2643B8E8">
+          <wp:inline distT="0" distB="0" distL="0" distR="0" wp14:anchorId="567F008F" wp14:editId="67B19571">
             <wp:extent cx="2644065" cy="1514246"/>
             <wp:effectExtent l="0" t="0" r="4445" b="0"/>
             <wp:docPr id="905873310" name="Picture 7"/>
@@ -3159,7 +3159,7 @@
           <w:szCs w:val="22"/>
         </w:rPr>
         <w:drawing>
-          <wp:inline distT="0" distB="0" distL="0" distR="0" wp14:anchorId="3FC607F9" wp14:editId="2C7882EE">
+          <wp:inline distT="0" distB="0" distL="0" distR="0" wp14:anchorId="3FC607F9" wp14:editId="24BFA88B">
             <wp:extent cx="2649158" cy="1513764"/>
             <wp:effectExtent l="0" t="0" r="0" b="0"/>
             <wp:docPr id="920090444" name="Picture 8"/>
@@ -5335,21 +5335,7 @@
                 <w:sz w:val="22"/>
                 <w:szCs w:val="22"/>
               </w:rPr>
-              <w:t>1</w:t>
-            </w:r>
-            <w:r>
-              <w:rPr>
-                <w:sz w:val="22"/>
-                <w:szCs w:val="22"/>
-              </w:rPr>
-              <w:t>.26</w:t>
-            </w:r>
-            <w:r>
-              <w:rPr>
-                <w:sz w:val="22"/>
-                <w:szCs w:val="22"/>
-              </w:rPr>
-              <w:t xml:space="preserve"> * 10</w:t>
+              <w:t>1.26 * 10</w:t>
             </w:r>
             <w:r>
               <w:rPr>
@@ -5414,14 +5400,7 @@
                 <w:sz w:val="22"/>
                 <w:szCs w:val="22"/>
               </w:rPr>
-              <w:t>5.54</w:t>
-            </w:r>
-            <w:r>
-              <w:rPr>
-                <w:sz w:val="22"/>
-                <w:szCs w:val="22"/>
-              </w:rPr>
-              <w:t xml:space="preserve"> * 10</w:t>
+              <w:t>5.54 * 10</w:t>
             </w:r>
             <w:r>
               <w:rPr>
@@ -5429,15 +5408,7 @@
                 <w:szCs w:val="22"/>
                 <w:vertAlign w:val="superscript"/>
               </w:rPr>
-              <w:t>-</w:t>
-            </w:r>
-            <w:r>
-              <w:rPr>
-                <w:sz w:val="22"/>
-                <w:szCs w:val="22"/>
-                <w:vertAlign w:val="superscript"/>
-              </w:rPr>
-              <w:t>5</w:t>
+              <w:t>-5</w:t>
             </w:r>
           </w:p>
         </w:tc>
@@ -5554,6 +5525,7 @@
       </w:pPr>
       <w:r>
         <w:rPr>
+          <w:noProof/>
           <w:sz w:val="22"/>
           <w:szCs w:val="22"/>
         </w:rPr>
@@ -5618,21 +5590,7 @@
           <w:sz w:val="22"/>
           <w:szCs w:val="22"/>
         </w:rPr>
-        <w:t xml:space="preserve">When we </w:t>
-      </w:r>
-      <w:r>
-        <w:rPr>
-          <w:sz w:val="22"/>
-          <w:szCs w:val="22"/>
-        </w:rPr>
-        <w:t>compare it</w:t>
-      </w:r>
-      <w:r>
-        <w:rPr>
-          <w:sz w:val="22"/>
-          <w:szCs w:val="22"/>
-        </w:rPr>
-        <w:t xml:space="preserve"> to a constant value, using the model will improve MAE by 52.7%.</w:t>
+        <w:t>When we compare it to a constant value, using the model will improve MAE by 52.7%.</w:t>
       </w:r>
     </w:p>
     <w:p>
@@ -5646,6 +5604,7 @@
       </w:pPr>
       <w:r>
         <w:rPr>
+          <w:noProof/>
           <w:sz w:val="22"/>
           <w:szCs w:val="22"/>
         </w:rPr>
@@ -6181,14 +6140,7 @@
                 <w:sz w:val="22"/>
                 <w:szCs w:val="22"/>
               </w:rPr>
-              <w:t>3.26</w:t>
-            </w:r>
-            <w:r>
-              <w:rPr>
-                <w:sz w:val="22"/>
-                <w:szCs w:val="22"/>
-              </w:rPr>
-              <w:t xml:space="preserve"> * 10</w:t>
+              <w:t>3.26 * 10</w:t>
             </w:r>
             <w:r>
               <w:rPr>
@@ -6253,14 +6205,7 @@
                 <w:sz w:val="22"/>
                 <w:szCs w:val="22"/>
               </w:rPr>
-              <w:t>4.64</w:t>
-            </w:r>
-            <w:r>
-              <w:rPr>
-                <w:sz w:val="22"/>
-                <w:szCs w:val="22"/>
-              </w:rPr>
-              <w:t xml:space="preserve"> * 10</w:t>
+              <w:t>4.64 * 10</w:t>
             </w:r>
             <w:r>
               <w:rPr>
@@ -6268,15 +6213,7 @@
                 <w:szCs w:val="22"/>
                 <w:vertAlign w:val="superscript"/>
               </w:rPr>
-              <w:t>-</w:t>
-            </w:r>
-            <w:r>
-              <w:rPr>
-                <w:sz w:val="22"/>
-                <w:szCs w:val="22"/>
-                <w:vertAlign w:val="superscript"/>
-              </w:rPr>
-              <w:t>4</w:t>
+              <w:t>-4</w:t>
             </w:r>
           </w:p>
         </w:tc>
@@ -6352,14 +6289,7 @@
           <w:sz w:val="22"/>
           <w:szCs w:val="22"/>
         </w:rPr>
-        <w:t>0</w:t>
-      </w:r>
-      <w:r>
-        <w:rPr>
-          <w:sz w:val="22"/>
-          <w:szCs w:val="22"/>
-        </w:rPr>
-        <w:t>134</w:t>
+        <w:t>0134</w:t>
       </w:r>
     </w:p>
     <w:p>
@@ -6367,6 +6297,9 @@
         <w:ind w:firstLine="360"/>
       </w:pPr>
       <w:r>
+        <w:rPr>
+          <w:noProof/>
+        </w:rPr>
         <w:drawing>
           <wp:inline distT="0" distB="0" distL="0" distR="0" wp14:anchorId="34B2F60F" wp14:editId="740337C1">
             <wp:extent cx="5135271" cy="2020093"/>
@@ -6420,6 +6353,9 @@
         <w:ind w:firstLine="360"/>
       </w:pPr>
       <w:r>
+        <w:rPr>
+          <w:noProof/>
+        </w:rPr>
         <w:drawing>
           <wp:inline distT="0" distB="0" distL="0" distR="0" wp14:anchorId="73EEADD2" wp14:editId="709C2B53">
             <wp:extent cx="2838298" cy="2654523"/>
@@ -7083,6 +7019,7 @@
       </w:pPr>
       <w:r>
         <w:rPr>
+          <w:noProof/>
           <w:sz w:val="22"/>
           <w:szCs w:val="22"/>
         </w:rPr>
@@ -7123,10 +7060,1578 @@
         </w:drawing>
       </w:r>
     </w:p>
-    <w:p/>
-    <w:p/>
-    <w:p/>
-    <w:p/>
+    <w:p>
+      <w:pPr>
+        <w:ind w:firstLine="360"/>
+      </w:pPr>
+      <w:r>
+        <w:t>Model improvement over constant τ*c</w:t>
+      </w:r>
+      <w:r>
+        <w:t xml:space="preserve">: </w:t>
+      </w:r>
+      <w:r>
+        <w:t>2.9</w:t>
+      </w:r>
+      <w:r>
+        <w:t>%</w:t>
+      </w:r>
+    </w:p>
+    <w:p>
+      <w:r>
+        <w:drawing>
+          <wp:inline distT="0" distB="0" distL="0" distR="0" wp14:anchorId="31F858D0" wp14:editId="7AD4BFEF">
+            <wp:extent cx="3495755" cy="3269411"/>
+            <wp:effectExtent l="0" t="0" r="0" b="7620"/>
+            <wp:docPr id="1767297127" name="Picture 1"/>
+            <wp:cNvGraphicFramePr>
+              <a:graphicFrameLocks xmlns:a="http://schemas.openxmlformats.org/drawingml/2006/main" noChangeAspect="1"/>
+            </wp:cNvGraphicFramePr>
+            <a:graphic xmlns:a="http://schemas.openxmlformats.org/drawingml/2006/main">
+              <a:graphicData uri="http://schemas.openxmlformats.org/drawingml/2006/picture">
+                <pic:pic xmlns:pic="http://schemas.openxmlformats.org/drawingml/2006/picture">
+                  <pic:nvPicPr>
+                    <pic:cNvPr id="1767297127" name=""/>
+                    <pic:cNvPicPr/>
+                  </pic:nvPicPr>
+                  <pic:blipFill>
+                    <a:blip r:embed="rId20"/>
+                    <a:stretch>
+                      <a:fillRect/>
+                    </a:stretch>
+                  </pic:blipFill>
+                  <pic:spPr>
+                    <a:xfrm>
+                      <a:off x="0" y="0"/>
+                      <a:ext cx="3498049" cy="3271556"/>
+                    </a:xfrm>
+                    <a:prstGeom prst="rect">
+                      <a:avLst/>
+                    </a:prstGeom>
+                  </pic:spPr>
+                </pic:pic>
+              </a:graphicData>
+            </a:graphic>
+          </wp:inline>
+        </w:drawing>
+      </w:r>
+    </w:p>
+    <w:p>
+      <w:pPr>
+        <w:pStyle w:val="Heading2"/>
+        <w:numPr>
+          <w:ilvl w:val="0"/>
+          <w:numId w:val="2"/>
+        </w:numPr>
+        <w:rPr>
+          <w:sz w:val="24"/>
+          <w:szCs w:val="24"/>
+        </w:rPr>
+      </w:pPr>
+      <w:r>
+        <w:rPr>
+          <w:sz w:val="24"/>
+          <w:szCs w:val="24"/>
+        </w:rPr>
+        <w:t>Independent Year Calibrations</w:t>
+      </w:r>
+    </w:p>
+    <w:p>
+      <w:pPr>
+        <w:pStyle w:val="ListParagraph"/>
+        <w:keepNext/>
+        <w:keepLines/>
+        <w:numPr>
+          <w:ilvl w:val="0"/>
+          <w:numId w:val="6"/>
+        </w:numPr>
+        <w:spacing w:before="160" w:after="80"/>
+        <w:contextualSpacing w:val="0"/>
+        <w:outlineLvl w:val="2"/>
+        <w:rPr>
+          <w:rFonts w:eastAsiaTheme="majorEastAsia" w:cstheme="majorBidi"/>
+          <w:vanish/>
+          <w:color w:val="0F4761" w:themeColor="accent1" w:themeShade="BF"/>
+        </w:rPr>
+      </w:pPr>
+    </w:p>
+    <w:p>
+      <w:pPr>
+        <w:pStyle w:val="Heading3"/>
+        <w:numPr>
+          <w:ilvl w:val="1"/>
+          <w:numId w:val="6"/>
+        </w:numPr>
+        <w:rPr>
+          <w:sz w:val="24"/>
+          <w:szCs w:val="24"/>
+        </w:rPr>
+      </w:pPr>
+      <w:r>
+        <w:rPr>
+          <w:sz w:val="24"/>
+          <w:szCs w:val="24"/>
+        </w:rPr>
+        <w:t>2022</w:t>
+      </w:r>
+    </w:p>
+    <w:p>
+      <w:pPr>
+        <w:pStyle w:val="ListParagraph"/>
+        <w:rPr>
+          <w:sz w:val="22"/>
+          <w:szCs w:val="22"/>
+        </w:rPr>
+      </w:pPr>
+      <w:r>
+        <w:rPr>
+          <w:sz w:val="22"/>
+          <w:szCs w:val="22"/>
+        </w:rPr>
+        <w:t xml:space="preserve">Data ranges: </w:t>
+      </w:r>
+    </w:p>
+    <w:tbl>
+      <w:tblPr>
+        <w:tblStyle w:val="TableGrid"/>
+        <w:tblW w:w="0" w:type="auto"/>
+        <w:tblInd w:w="1597" w:type="dxa"/>
+        <w:tblLook w:val="04A0" w:firstRow="1" w:lastRow="0" w:firstColumn="1" w:lastColumn="0" w:noHBand="0" w:noVBand="1"/>
+      </w:tblPr>
+      <w:tblGrid>
+        <w:gridCol w:w="805"/>
+        <w:gridCol w:w="1260"/>
+        <w:gridCol w:w="720"/>
+      </w:tblGrid>
+      <w:tr>
+        <w:tc>
+          <w:tcPr>
+            <w:tcW w:w="805" w:type="dxa"/>
+          </w:tcPr>
+          <w:p>
+            <w:pPr>
+              <w:pStyle w:val="ListParagraph"/>
+              <w:ind w:left="0"/>
+              <w:jc w:val="center"/>
+              <w:rPr>
+                <w:sz w:val="22"/>
+                <w:szCs w:val="22"/>
+                <w:vertAlign w:val="subscript"/>
+              </w:rPr>
+            </w:pPr>
+            <w:r>
+              <w:rPr>
+                <w:sz w:val="22"/>
+                <w:szCs w:val="22"/>
+              </w:rPr>
+              <w:t>K</w:t>
+            </w:r>
+            <w:r>
+              <w:rPr>
+                <w:sz w:val="22"/>
+                <w:szCs w:val="22"/>
+                <w:vertAlign w:val="subscript"/>
+              </w:rPr>
+              <w:t>1</w:t>
+            </w:r>
+          </w:p>
+        </w:tc>
+        <w:tc>
+          <w:tcPr>
+            <w:tcW w:w="1260" w:type="dxa"/>
+          </w:tcPr>
+          <w:p>
+            <w:pPr>
+              <w:pStyle w:val="ListParagraph"/>
+              <w:ind w:left="0"/>
+              <w:rPr>
+                <w:sz w:val="22"/>
+                <w:szCs w:val="22"/>
+                <w:vertAlign w:val="superscript"/>
+              </w:rPr>
+            </w:pPr>
+            <w:r>
+              <w:rPr>
+                <w:sz w:val="22"/>
+                <w:szCs w:val="22"/>
+              </w:rPr>
+              <w:t>10</w:t>
+            </w:r>
+            <w:r>
+              <w:rPr>
+                <w:sz w:val="22"/>
+                <w:szCs w:val="22"/>
+                <w:vertAlign w:val="superscript"/>
+              </w:rPr>
+              <w:t>-6</w:t>
+            </w:r>
+            <w:r>
+              <w:rPr>
+                <w:sz w:val="22"/>
+                <w:szCs w:val="22"/>
+              </w:rPr>
+              <w:t xml:space="preserve"> – 10</w:t>
+            </w:r>
+            <w:r>
+              <w:rPr>
+                <w:sz w:val="22"/>
+                <w:szCs w:val="22"/>
+                <w:vertAlign w:val="superscript"/>
+              </w:rPr>
+              <w:t>-2</w:t>
+            </w:r>
+          </w:p>
+        </w:tc>
+        <w:tc>
+          <w:tcPr>
+            <w:tcW w:w="720" w:type="dxa"/>
+          </w:tcPr>
+          <w:p>
+            <w:pPr>
+              <w:pStyle w:val="ListParagraph"/>
+              <w:ind w:left="0"/>
+              <w:rPr>
+                <w:sz w:val="22"/>
+                <w:szCs w:val="22"/>
+              </w:rPr>
+            </w:pPr>
+            <w:r>
+              <w:rPr>
+                <w:sz w:val="22"/>
+                <w:szCs w:val="22"/>
+              </w:rPr>
+              <w:t>n=40</w:t>
+            </w:r>
+          </w:p>
+        </w:tc>
+      </w:tr>
+      <w:tr>
+        <w:tc>
+          <w:tcPr>
+            <w:tcW w:w="805" w:type="dxa"/>
+          </w:tcPr>
+          <w:p>
+            <w:pPr>
+              <w:pStyle w:val="ListParagraph"/>
+              <w:ind w:left="0"/>
+              <w:jc w:val="center"/>
+              <w:rPr>
+                <w:sz w:val="22"/>
+                <w:szCs w:val="22"/>
+                <w:vertAlign w:val="subscript"/>
+              </w:rPr>
+            </w:pPr>
+            <w:r>
+              <w:rPr>
+                <w:sz w:val="22"/>
+                <w:szCs w:val="22"/>
+              </w:rPr>
+              <w:t>K</w:t>
+            </w:r>
+            <w:r>
+              <w:rPr>
+                <w:sz w:val="22"/>
+                <w:szCs w:val="22"/>
+                <w:vertAlign w:val="subscript"/>
+              </w:rPr>
+              <w:t>2</w:t>
+            </w:r>
+          </w:p>
+        </w:tc>
+        <w:tc>
+          <w:tcPr>
+            <w:tcW w:w="1260" w:type="dxa"/>
+          </w:tcPr>
+          <w:p>
+            <w:pPr>
+              <w:pStyle w:val="ListParagraph"/>
+              <w:ind w:left="0"/>
+              <w:rPr>
+                <w:sz w:val="22"/>
+                <w:szCs w:val="22"/>
+              </w:rPr>
+            </w:pPr>
+            <w:r>
+              <w:rPr>
+                <w:sz w:val="22"/>
+                <w:szCs w:val="22"/>
+              </w:rPr>
+              <w:t>10</w:t>
+            </w:r>
+            <w:r>
+              <w:rPr>
+                <w:sz w:val="22"/>
+                <w:szCs w:val="22"/>
+                <w:vertAlign w:val="superscript"/>
+              </w:rPr>
+              <w:t>-6</w:t>
+            </w:r>
+            <w:r>
+              <w:rPr>
+                <w:sz w:val="22"/>
+                <w:szCs w:val="22"/>
+              </w:rPr>
+              <w:t xml:space="preserve"> – 10</w:t>
+            </w:r>
+            <w:r>
+              <w:rPr>
+                <w:sz w:val="22"/>
+                <w:szCs w:val="22"/>
+                <w:vertAlign w:val="superscript"/>
+              </w:rPr>
+              <w:t>-2</w:t>
+            </w:r>
+          </w:p>
+        </w:tc>
+        <w:tc>
+          <w:tcPr>
+            <w:tcW w:w="720" w:type="dxa"/>
+          </w:tcPr>
+          <w:p>
+            <w:pPr>
+              <w:pStyle w:val="ListParagraph"/>
+              <w:ind w:left="0"/>
+              <w:rPr>
+                <w:sz w:val="22"/>
+                <w:szCs w:val="22"/>
+              </w:rPr>
+            </w:pPr>
+            <w:r>
+              <w:rPr>
+                <w:sz w:val="22"/>
+                <w:szCs w:val="22"/>
+              </w:rPr>
+              <w:t>n=40</w:t>
+            </w:r>
+          </w:p>
+        </w:tc>
+      </w:tr>
+      <w:tr>
+        <w:tc>
+          <w:tcPr>
+            <w:tcW w:w="805" w:type="dxa"/>
+          </w:tcPr>
+          <w:p>
+            <w:pPr>
+              <w:pStyle w:val="ListParagraph"/>
+              <w:ind w:left="0"/>
+              <w:jc w:val="center"/>
+              <w:rPr>
+                <w:sz w:val="22"/>
+                <w:szCs w:val="22"/>
+              </w:rPr>
+            </w:pPr>
+            <w:r>
+              <w:rPr>
+                <w:rFonts w:ascii="Calibri" w:hAnsi="Calibri" w:cs="Calibri"/>
+                <w:sz w:val="22"/>
+                <w:szCs w:val="22"/>
+              </w:rPr>
+              <w:t>ε</w:t>
+            </w:r>
+          </w:p>
+        </w:tc>
+        <w:tc>
+          <w:tcPr>
+            <w:tcW w:w="1260" w:type="dxa"/>
+          </w:tcPr>
+          <w:p>
+            <w:pPr>
+              <w:pStyle w:val="ListParagraph"/>
+              <w:ind w:left="0"/>
+              <w:rPr>
+                <w:sz w:val="22"/>
+                <w:szCs w:val="22"/>
+              </w:rPr>
+            </w:pPr>
+            <w:r>
+              <w:rPr>
+                <w:sz w:val="22"/>
+                <w:szCs w:val="22"/>
+              </w:rPr>
+              <w:t>1-10</w:t>
+            </w:r>
+          </w:p>
+        </w:tc>
+        <w:tc>
+          <w:tcPr>
+            <w:tcW w:w="720" w:type="dxa"/>
+          </w:tcPr>
+          <w:p>
+            <w:pPr>
+              <w:pStyle w:val="ListParagraph"/>
+              <w:ind w:left="0"/>
+              <w:rPr>
+                <w:sz w:val="22"/>
+                <w:szCs w:val="22"/>
+              </w:rPr>
+            </w:pPr>
+            <w:r>
+              <w:rPr>
+                <w:sz w:val="22"/>
+                <w:szCs w:val="22"/>
+              </w:rPr>
+              <w:t>n=10</w:t>
+            </w:r>
+          </w:p>
+        </w:tc>
+      </w:tr>
+    </w:tbl>
+    <w:p>
+      <w:pPr>
+        <w:pStyle w:val="ListParagraph"/>
+        <w:rPr>
+          <w:sz w:val="22"/>
+          <w:szCs w:val="22"/>
+        </w:rPr>
+      </w:pPr>
+      <w:r>
+        <w:rPr>
+          <w:sz w:val="22"/>
+          <w:szCs w:val="22"/>
+        </w:rPr>
+        <w:t xml:space="preserve">Min and max from Masteller 2025: 0.08 – 0.2 (from La Jara </w:t>
+      </w:r>
+      <w:r>
+        <w:rPr>
+          <w:i/>
+          <w:iCs/>
+          <w:sz w:val="22"/>
+          <w:szCs w:val="22"/>
+        </w:rPr>
+        <w:t xml:space="preserve">τ*c </w:t>
+      </w:r>
+      <w:r>
+        <w:rPr>
+          <w:sz w:val="22"/>
+          <w:szCs w:val="22"/>
+        </w:rPr>
+        <w:t>measurements)</w:t>
+      </w:r>
+    </w:p>
+    <w:p>
+      <w:pPr>
+        <w:pStyle w:val="ListParagraph"/>
+        <w:rPr>
+          <w:sz w:val="22"/>
+          <w:szCs w:val="22"/>
+        </w:rPr>
+      </w:pPr>
+      <w:r>
+        <w:rPr>
+          <w:sz w:val="22"/>
+          <w:szCs w:val="22"/>
+        </w:rPr>
+        <w:t xml:space="preserve">Best fit: </w:t>
+      </w:r>
+    </w:p>
+    <w:tbl>
+      <w:tblPr>
+        <w:tblStyle w:val="TableGrid"/>
+        <w:tblW w:w="0" w:type="auto"/>
+        <w:tblInd w:w="1746" w:type="dxa"/>
+        <w:tblLook w:val="04A0" w:firstRow="1" w:lastRow="0" w:firstColumn="1" w:lastColumn="0" w:noHBand="0" w:noVBand="1"/>
+      </w:tblPr>
+      <w:tblGrid>
+        <w:gridCol w:w="805"/>
+        <w:gridCol w:w="3024"/>
+      </w:tblGrid>
+      <w:tr>
+        <w:tc>
+          <w:tcPr>
+            <w:tcW w:w="805" w:type="dxa"/>
+          </w:tcPr>
+          <w:p>
+            <w:pPr>
+              <w:pStyle w:val="ListParagraph"/>
+              <w:ind w:left="0"/>
+              <w:jc w:val="center"/>
+              <w:rPr>
+                <w:sz w:val="22"/>
+                <w:szCs w:val="22"/>
+                <w:vertAlign w:val="subscript"/>
+              </w:rPr>
+            </w:pPr>
+            <w:r>
+              <w:rPr>
+                <w:sz w:val="22"/>
+                <w:szCs w:val="22"/>
+              </w:rPr>
+              <w:t>K</w:t>
+            </w:r>
+            <w:r>
+              <w:rPr>
+                <w:sz w:val="22"/>
+                <w:szCs w:val="22"/>
+                <w:vertAlign w:val="subscript"/>
+              </w:rPr>
+              <w:t>1</w:t>
+            </w:r>
+          </w:p>
+        </w:tc>
+        <w:tc>
+          <w:tcPr>
+            <w:tcW w:w="3024" w:type="dxa"/>
+          </w:tcPr>
+          <w:p>
+            <w:pPr>
+              <w:jc w:val="center"/>
+              <w:rPr>
+                <w:sz w:val="22"/>
+                <w:szCs w:val="22"/>
+              </w:rPr>
+            </w:pPr>
+            <w:r>
+              <w:rPr>
+                <w:sz w:val="22"/>
+                <w:szCs w:val="22"/>
+              </w:rPr>
+              <w:t>1.06</w:t>
+            </w:r>
+            <w:r>
+              <w:rPr>
+                <w:sz w:val="22"/>
+                <w:szCs w:val="22"/>
+              </w:rPr>
+              <w:t>1</w:t>
+            </w:r>
+            <w:r>
+              <w:rPr>
+                <w:sz w:val="22"/>
+                <w:szCs w:val="22"/>
+              </w:rPr>
+              <w:t xml:space="preserve"> * 10</w:t>
+            </w:r>
+            <w:r>
+              <w:rPr>
+                <w:sz w:val="22"/>
+                <w:szCs w:val="22"/>
+                <w:vertAlign w:val="superscript"/>
+              </w:rPr>
+              <w:t>-</w:t>
+            </w:r>
+            <w:r>
+              <w:rPr>
+                <w:sz w:val="22"/>
+                <w:szCs w:val="22"/>
+                <w:vertAlign w:val="superscript"/>
+              </w:rPr>
+              <w:t>5</w:t>
+            </w:r>
+          </w:p>
+        </w:tc>
+      </w:tr>
+      <w:tr>
+        <w:tc>
+          <w:tcPr>
+            <w:tcW w:w="805" w:type="dxa"/>
+          </w:tcPr>
+          <w:p>
+            <w:pPr>
+              <w:pStyle w:val="ListParagraph"/>
+              <w:ind w:left="0"/>
+              <w:jc w:val="center"/>
+              <w:rPr>
+                <w:sz w:val="22"/>
+                <w:szCs w:val="22"/>
+                <w:vertAlign w:val="subscript"/>
+              </w:rPr>
+            </w:pPr>
+            <w:r>
+              <w:rPr>
+                <w:sz w:val="22"/>
+                <w:szCs w:val="22"/>
+              </w:rPr>
+              <w:t>K</w:t>
+            </w:r>
+            <w:r>
+              <w:rPr>
+                <w:sz w:val="22"/>
+                <w:szCs w:val="22"/>
+                <w:vertAlign w:val="subscript"/>
+              </w:rPr>
+              <w:t>2</w:t>
+            </w:r>
+          </w:p>
+        </w:tc>
+        <w:tc>
+          <w:tcPr>
+            <w:tcW w:w="3024" w:type="dxa"/>
+          </w:tcPr>
+          <w:p>
+            <w:pPr>
+              <w:jc w:val="center"/>
+              <w:rPr>
+                <w:rFonts w:ascii="Aptos Narrow" w:hAnsi="Aptos Narrow"/>
+                <w:color w:val="000000"/>
+                <w:sz w:val="22"/>
+                <w:szCs w:val="22"/>
+              </w:rPr>
+            </w:pPr>
+            <w:r>
+              <w:rPr>
+                <w:rFonts w:ascii="Aptos Narrow" w:hAnsi="Aptos Narrow"/>
+                <w:color w:val="000000"/>
+                <w:sz w:val="22"/>
+                <w:szCs w:val="22"/>
+              </w:rPr>
+              <w:t>0.0049</w:t>
+            </w:r>
+          </w:p>
+        </w:tc>
+      </w:tr>
+      <w:tr>
+        <w:tc>
+          <w:tcPr>
+            <w:tcW w:w="805" w:type="dxa"/>
+          </w:tcPr>
+          <w:p>
+            <w:pPr>
+              <w:pStyle w:val="ListParagraph"/>
+              <w:ind w:left="0"/>
+              <w:jc w:val="center"/>
+              <w:rPr>
+                <w:sz w:val="22"/>
+                <w:szCs w:val="22"/>
+              </w:rPr>
+            </w:pPr>
+            <w:r>
+              <w:rPr>
+                <w:rFonts w:ascii="Calibri" w:hAnsi="Calibri" w:cs="Calibri"/>
+                <w:sz w:val="22"/>
+                <w:szCs w:val="22"/>
+              </w:rPr>
+              <w:t>ε</w:t>
+            </w:r>
+          </w:p>
+        </w:tc>
+        <w:tc>
+          <w:tcPr>
+            <w:tcW w:w="3024" w:type="dxa"/>
+          </w:tcPr>
+          <w:p>
+            <w:pPr>
+              <w:pStyle w:val="ListParagraph"/>
+              <w:ind w:left="0"/>
+              <w:jc w:val="center"/>
+              <w:rPr>
+                <w:sz w:val="22"/>
+                <w:szCs w:val="22"/>
+              </w:rPr>
+            </w:pPr>
+            <w:r>
+              <w:rPr>
+                <w:sz w:val="22"/>
+                <w:szCs w:val="22"/>
+              </w:rPr>
+              <w:t>1</w:t>
+            </w:r>
+          </w:p>
+        </w:tc>
+      </w:tr>
+    </w:tbl>
+    <w:p>
+      <w:pPr>
+        <w:pStyle w:val="ListParagraph"/>
+        <w:rPr>
+          <w:sz w:val="22"/>
+          <w:szCs w:val="22"/>
+        </w:rPr>
+      </w:pPr>
+      <w:r>
+        <w:rPr>
+          <w:sz w:val="22"/>
+          <w:szCs w:val="22"/>
+        </w:rPr>
+        <w:t xml:space="preserve">MAE = </w:t>
+      </w:r>
+      <w:r>
+        <w:rPr>
+          <w:sz w:val="22"/>
+          <w:szCs w:val="22"/>
+        </w:rPr>
+        <w:t>0.0</w:t>
+      </w:r>
+      <w:r>
+        <w:rPr>
+          <w:sz w:val="22"/>
+          <w:szCs w:val="22"/>
+        </w:rPr>
+        <w:t>05</w:t>
+      </w:r>
+    </w:p>
+    <w:p>
+      <w:pPr>
+        <w:pStyle w:val="ListParagraph"/>
+        <w:rPr>
+          <w:sz w:val="22"/>
+          <w:szCs w:val="22"/>
+        </w:rPr>
+      </w:pPr>
+    </w:p>
+    <w:p>
+      <w:pPr>
+        <w:rPr>
+          <w:sz w:val="22"/>
+          <w:szCs w:val="22"/>
+        </w:rPr>
+      </w:pPr>
+      <w:r>
+        <w:drawing>
+          <wp:inline distT="0" distB="0" distL="0" distR="0" wp14:anchorId="24CBD646" wp14:editId="2D1C4B31">
+            <wp:extent cx="5943600" cy="2341245"/>
+            <wp:effectExtent l="0" t="0" r="0" b="1905"/>
+            <wp:docPr id="1839977041" name="Picture 1"/>
+            <wp:cNvGraphicFramePr>
+              <a:graphicFrameLocks xmlns:a="http://schemas.openxmlformats.org/drawingml/2006/main" noChangeAspect="1"/>
+            </wp:cNvGraphicFramePr>
+            <a:graphic xmlns:a="http://schemas.openxmlformats.org/drawingml/2006/main">
+              <a:graphicData uri="http://schemas.openxmlformats.org/drawingml/2006/picture">
+                <pic:pic xmlns:pic="http://schemas.openxmlformats.org/drawingml/2006/picture">
+                  <pic:nvPicPr>
+                    <pic:cNvPr id="1839977041" name=""/>
+                    <pic:cNvPicPr/>
+                  </pic:nvPicPr>
+                  <pic:blipFill>
+                    <a:blip r:embed="rId21"/>
+                    <a:stretch>
+                      <a:fillRect/>
+                    </a:stretch>
+                  </pic:blipFill>
+                  <pic:spPr>
+                    <a:xfrm>
+                      <a:off x="0" y="0"/>
+                      <a:ext cx="5943600" cy="2341245"/>
+                    </a:xfrm>
+                    <a:prstGeom prst="rect">
+                      <a:avLst/>
+                    </a:prstGeom>
+                  </pic:spPr>
+                </pic:pic>
+              </a:graphicData>
+            </a:graphic>
+          </wp:inline>
+        </w:drawing>
+      </w:r>
+    </w:p>
+    <w:p>
+      <w:pPr>
+        <w:ind w:firstLine="360"/>
+      </w:pPr>
+      <w:r>
+        <w:t>Model improvement over constant τ*c</w:t>
+      </w:r>
+      <w:r>
+        <w:t xml:space="preserve">: </w:t>
+      </w:r>
+      <w:r>
+        <w:t>11.4</w:t>
+      </w:r>
+      <w:r>
+        <w:t>%</w:t>
+      </w:r>
+    </w:p>
+    <w:p>
+      <w:pPr>
+        <w:pStyle w:val="ListParagraph"/>
+      </w:pPr>
+      <w:r>
+        <w:drawing>
+          <wp:inline distT="0" distB="0" distL="0" distR="0" wp14:anchorId="328C6FA9" wp14:editId="31358777">
+            <wp:extent cx="3589338" cy="3076575"/>
+            <wp:effectExtent l="0" t="0" r="0" b="0"/>
+            <wp:docPr id="1005639354" name="Picture 1"/>
+            <wp:cNvGraphicFramePr>
+              <a:graphicFrameLocks xmlns:a="http://schemas.openxmlformats.org/drawingml/2006/main" noChangeAspect="1"/>
+            </wp:cNvGraphicFramePr>
+            <a:graphic xmlns:a="http://schemas.openxmlformats.org/drawingml/2006/main">
+              <a:graphicData uri="http://schemas.openxmlformats.org/drawingml/2006/picture">
+                <pic:pic xmlns:pic="http://schemas.openxmlformats.org/drawingml/2006/picture">
+                  <pic:nvPicPr>
+                    <pic:cNvPr id="1005639354" name=""/>
+                    <pic:cNvPicPr/>
+                  </pic:nvPicPr>
+                  <pic:blipFill>
+                    <a:blip r:embed="rId22"/>
+                    <a:stretch>
+                      <a:fillRect/>
+                    </a:stretch>
+                  </pic:blipFill>
+                  <pic:spPr>
+                    <a:xfrm>
+                      <a:off x="0" y="0"/>
+                      <a:ext cx="3591584" cy="3078500"/>
+                    </a:xfrm>
+                    <a:prstGeom prst="rect">
+                      <a:avLst/>
+                    </a:prstGeom>
+                  </pic:spPr>
+                </pic:pic>
+              </a:graphicData>
+            </a:graphic>
+          </wp:inline>
+        </w:drawing>
+      </w:r>
+    </w:p>
+    <w:p>
+      <w:pPr>
+        <w:pStyle w:val="Heading3"/>
+        <w:numPr>
+          <w:ilvl w:val="1"/>
+          <w:numId w:val="6"/>
+        </w:numPr>
+        <w:rPr>
+          <w:sz w:val="24"/>
+          <w:szCs w:val="24"/>
+        </w:rPr>
+      </w:pPr>
+      <w:r>
+        <w:rPr>
+          <w:sz w:val="24"/>
+          <w:szCs w:val="24"/>
+        </w:rPr>
+        <w:t>2023</w:t>
+      </w:r>
+    </w:p>
+    <w:p>
+      <w:pPr>
+        <w:pStyle w:val="ListParagraph"/>
+        <w:rPr>
+          <w:sz w:val="22"/>
+          <w:szCs w:val="22"/>
+        </w:rPr>
+      </w:pPr>
+      <w:r>
+        <w:rPr>
+          <w:sz w:val="22"/>
+          <w:szCs w:val="22"/>
+        </w:rPr>
+        <w:t xml:space="preserve">Data ranges: </w:t>
+      </w:r>
+    </w:p>
+    <w:tbl>
+      <w:tblPr>
+        <w:tblStyle w:val="TableGrid"/>
+        <w:tblW w:w="0" w:type="auto"/>
+        <w:tblInd w:w="1597" w:type="dxa"/>
+        <w:tblLook w:val="04A0" w:firstRow="1" w:lastRow="0" w:firstColumn="1" w:lastColumn="0" w:noHBand="0" w:noVBand="1"/>
+      </w:tblPr>
+      <w:tblGrid>
+        <w:gridCol w:w="805"/>
+        <w:gridCol w:w="1260"/>
+        <w:gridCol w:w="720"/>
+      </w:tblGrid>
+      <w:tr>
+        <w:tc>
+          <w:tcPr>
+            <w:tcW w:w="805" w:type="dxa"/>
+          </w:tcPr>
+          <w:p>
+            <w:pPr>
+              <w:pStyle w:val="ListParagraph"/>
+              <w:ind w:left="0"/>
+              <w:jc w:val="center"/>
+              <w:rPr>
+                <w:sz w:val="22"/>
+                <w:szCs w:val="22"/>
+                <w:vertAlign w:val="subscript"/>
+              </w:rPr>
+            </w:pPr>
+            <w:r>
+              <w:rPr>
+                <w:sz w:val="22"/>
+                <w:szCs w:val="22"/>
+              </w:rPr>
+              <w:t>K</w:t>
+            </w:r>
+            <w:r>
+              <w:rPr>
+                <w:sz w:val="22"/>
+                <w:szCs w:val="22"/>
+                <w:vertAlign w:val="subscript"/>
+              </w:rPr>
+              <w:t>1</w:t>
+            </w:r>
+          </w:p>
+        </w:tc>
+        <w:tc>
+          <w:tcPr>
+            <w:tcW w:w="1260" w:type="dxa"/>
+          </w:tcPr>
+          <w:p>
+            <w:pPr>
+              <w:pStyle w:val="ListParagraph"/>
+              <w:ind w:left="0"/>
+              <w:rPr>
+                <w:sz w:val="22"/>
+                <w:szCs w:val="22"/>
+                <w:vertAlign w:val="superscript"/>
+              </w:rPr>
+            </w:pPr>
+            <w:r>
+              <w:rPr>
+                <w:sz w:val="22"/>
+                <w:szCs w:val="22"/>
+              </w:rPr>
+              <w:t>10</w:t>
+            </w:r>
+            <w:r>
+              <w:rPr>
+                <w:sz w:val="22"/>
+                <w:szCs w:val="22"/>
+                <w:vertAlign w:val="superscript"/>
+              </w:rPr>
+              <w:t>-6</w:t>
+            </w:r>
+            <w:r>
+              <w:rPr>
+                <w:sz w:val="22"/>
+                <w:szCs w:val="22"/>
+              </w:rPr>
+              <w:t xml:space="preserve"> – 10</w:t>
+            </w:r>
+            <w:r>
+              <w:rPr>
+                <w:sz w:val="22"/>
+                <w:szCs w:val="22"/>
+                <w:vertAlign w:val="superscript"/>
+              </w:rPr>
+              <w:t>-2</w:t>
+            </w:r>
+          </w:p>
+        </w:tc>
+        <w:tc>
+          <w:tcPr>
+            <w:tcW w:w="720" w:type="dxa"/>
+          </w:tcPr>
+          <w:p>
+            <w:pPr>
+              <w:pStyle w:val="ListParagraph"/>
+              <w:ind w:left="0"/>
+              <w:rPr>
+                <w:sz w:val="22"/>
+                <w:szCs w:val="22"/>
+              </w:rPr>
+            </w:pPr>
+            <w:r>
+              <w:rPr>
+                <w:sz w:val="22"/>
+                <w:szCs w:val="22"/>
+              </w:rPr>
+              <w:t>n=40</w:t>
+            </w:r>
+          </w:p>
+        </w:tc>
+      </w:tr>
+      <w:tr>
+        <w:tc>
+          <w:tcPr>
+            <w:tcW w:w="805" w:type="dxa"/>
+          </w:tcPr>
+          <w:p>
+            <w:pPr>
+              <w:pStyle w:val="ListParagraph"/>
+              <w:ind w:left="0"/>
+              <w:jc w:val="center"/>
+              <w:rPr>
+                <w:sz w:val="22"/>
+                <w:szCs w:val="22"/>
+                <w:vertAlign w:val="subscript"/>
+              </w:rPr>
+            </w:pPr>
+            <w:r>
+              <w:rPr>
+                <w:sz w:val="22"/>
+                <w:szCs w:val="22"/>
+              </w:rPr>
+              <w:t>K</w:t>
+            </w:r>
+            <w:r>
+              <w:rPr>
+                <w:sz w:val="22"/>
+                <w:szCs w:val="22"/>
+                <w:vertAlign w:val="subscript"/>
+              </w:rPr>
+              <w:t>2</w:t>
+            </w:r>
+          </w:p>
+        </w:tc>
+        <w:tc>
+          <w:tcPr>
+            <w:tcW w:w="1260" w:type="dxa"/>
+          </w:tcPr>
+          <w:p>
+            <w:pPr>
+              <w:pStyle w:val="ListParagraph"/>
+              <w:ind w:left="0"/>
+              <w:rPr>
+                <w:sz w:val="22"/>
+                <w:szCs w:val="22"/>
+              </w:rPr>
+            </w:pPr>
+            <w:r>
+              <w:rPr>
+                <w:sz w:val="22"/>
+                <w:szCs w:val="22"/>
+              </w:rPr>
+              <w:t>10</w:t>
+            </w:r>
+            <w:r>
+              <w:rPr>
+                <w:sz w:val="22"/>
+                <w:szCs w:val="22"/>
+                <w:vertAlign w:val="superscript"/>
+              </w:rPr>
+              <w:t>-6</w:t>
+            </w:r>
+            <w:r>
+              <w:rPr>
+                <w:sz w:val="22"/>
+                <w:szCs w:val="22"/>
+              </w:rPr>
+              <w:t xml:space="preserve"> – 10</w:t>
+            </w:r>
+            <w:r>
+              <w:rPr>
+                <w:sz w:val="22"/>
+                <w:szCs w:val="22"/>
+                <w:vertAlign w:val="superscript"/>
+              </w:rPr>
+              <w:t>-2</w:t>
+            </w:r>
+          </w:p>
+        </w:tc>
+        <w:tc>
+          <w:tcPr>
+            <w:tcW w:w="720" w:type="dxa"/>
+          </w:tcPr>
+          <w:p>
+            <w:pPr>
+              <w:pStyle w:val="ListParagraph"/>
+              <w:ind w:left="0"/>
+              <w:rPr>
+                <w:sz w:val="22"/>
+                <w:szCs w:val="22"/>
+              </w:rPr>
+            </w:pPr>
+            <w:r>
+              <w:rPr>
+                <w:sz w:val="22"/>
+                <w:szCs w:val="22"/>
+              </w:rPr>
+              <w:t>n=40</w:t>
+            </w:r>
+          </w:p>
+        </w:tc>
+      </w:tr>
+      <w:tr>
+        <w:tc>
+          <w:tcPr>
+            <w:tcW w:w="805" w:type="dxa"/>
+          </w:tcPr>
+          <w:p>
+            <w:pPr>
+              <w:pStyle w:val="ListParagraph"/>
+              <w:ind w:left="0"/>
+              <w:jc w:val="center"/>
+              <w:rPr>
+                <w:sz w:val="22"/>
+                <w:szCs w:val="22"/>
+              </w:rPr>
+            </w:pPr>
+            <w:r>
+              <w:rPr>
+                <w:rFonts w:ascii="Calibri" w:hAnsi="Calibri" w:cs="Calibri"/>
+                <w:sz w:val="22"/>
+                <w:szCs w:val="22"/>
+              </w:rPr>
+              <w:t>ε</w:t>
+            </w:r>
+          </w:p>
+        </w:tc>
+        <w:tc>
+          <w:tcPr>
+            <w:tcW w:w="1260" w:type="dxa"/>
+          </w:tcPr>
+          <w:p>
+            <w:pPr>
+              <w:pStyle w:val="ListParagraph"/>
+              <w:ind w:left="0"/>
+              <w:rPr>
+                <w:sz w:val="22"/>
+                <w:szCs w:val="22"/>
+              </w:rPr>
+            </w:pPr>
+            <w:r>
+              <w:rPr>
+                <w:sz w:val="22"/>
+                <w:szCs w:val="22"/>
+              </w:rPr>
+              <w:t>1-10</w:t>
+            </w:r>
+          </w:p>
+        </w:tc>
+        <w:tc>
+          <w:tcPr>
+            <w:tcW w:w="720" w:type="dxa"/>
+          </w:tcPr>
+          <w:p>
+            <w:pPr>
+              <w:pStyle w:val="ListParagraph"/>
+              <w:ind w:left="0"/>
+              <w:rPr>
+                <w:sz w:val="22"/>
+                <w:szCs w:val="22"/>
+              </w:rPr>
+            </w:pPr>
+            <w:r>
+              <w:rPr>
+                <w:sz w:val="22"/>
+                <w:szCs w:val="22"/>
+              </w:rPr>
+              <w:t>n=10</w:t>
+            </w:r>
+          </w:p>
+        </w:tc>
+      </w:tr>
+    </w:tbl>
+    <w:p>
+      <w:pPr>
+        <w:pStyle w:val="ListParagraph"/>
+        <w:rPr>
+          <w:sz w:val="22"/>
+          <w:szCs w:val="22"/>
+        </w:rPr>
+      </w:pPr>
+      <w:r>
+        <w:rPr>
+          <w:sz w:val="22"/>
+          <w:szCs w:val="22"/>
+        </w:rPr>
+        <w:t xml:space="preserve">Min and max from Masteller 2025: 0.08 – 0.2 (from La Jara </w:t>
+      </w:r>
+      <w:r>
+        <w:rPr>
+          <w:i/>
+          <w:iCs/>
+          <w:sz w:val="22"/>
+          <w:szCs w:val="22"/>
+        </w:rPr>
+        <w:t xml:space="preserve">τ*c </w:t>
+      </w:r>
+      <w:r>
+        <w:rPr>
+          <w:sz w:val="22"/>
+          <w:szCs w:val="22"/>
+        </w:rPr>
+        <w:t>measurements)</w:t>
+      </w:r>
+    </w:p>
+    <w:p>
+      <w:pPr>
+        <w:pStyle w:val="ListParagraph"/>
+        <w:rPr>
+          <w:sz w:val="22"/>
+          <w:szCs w:val="22"/>
+        </w:rPr>
+      </w:pPr>
+    </w:p>
+    <w:p>
+      <w:pPr>
+        <w:pStyle w:val="ListParagraph"/>
+        <w:rPr>
+          <w:sz w:val="22"/>
+          <w:szCs w:val="22"/>
+        </w:rPr>
+      </w:pPr>
+      <w:r>
+        <w:rPr>
+          <w:sz w:val="22"/>
+          <w:szCs w:val="22"/>
+        </w:rPr>
+        <w:t xml:space="preserve">Best fit: </w:t>
+      </w:r>
+    </w:p>
+    <w:tbl>
+      <w:tblPr>
+        <w:tblStyle w:val="TableGrid"/>
+        <w:tblW w:w="0" w:type="auto"/>
+        <w:tblInd w:w="1746" w:type="dxa"/>
+        <w:tblLook w:val="04A0" w:firstRow="1" w:lastRow="0" w:firstColumn="1" w:lastColumn="0" w:noHBand="0" w:noVBand="1"/>
+      </w:tblPr>
+      <w:tblGrid>
+        <w:gridCol w:w="805"/>
+        <w:gridCol w:w="3024"/>
+      </w:tblGrid>
+      <w:tr>
+        <w:tc>
+          <w:tcPr>
+            <w:tcW w:w="805" w:type="dxa"/>
+          </w:tcPr>
+          <w:p>
+            <w:pPr>
+              <w:pStyle w:val="ListParagraph"/>
+              <w:ind w:left="0"/>
+              <w:jc w:val="center"/>
+              <w:rPr>
+                <w:sz w:val="22"/>
+                <w:szCs w:val="22"/>
+                <w:vertAlign w:val="subscript"/>
+              </w:rPr>
+            </w:pPr>
+            <w:r>
+              <w:rPr>
+                <w:sz w:val="22"/>
+                <w:szCs w:val="22"/>
+              </w:rPr>
+              <w:t>K</w:t>
+            </w:r>
+            <w:r>
+              <w:rPr>
+                <w:sz w:val="22"/>
+                <w:szCs w:val="22"/>
+                <w:vertAlign w:val="subscript"/>
+              </w:rPr>
+              <w:t>1</w:t>
+            </w:r>
+          </w:p>
+        </w:tc>
+        <w:tc>
+          <w:tcPr>
+            <w:tcW w:w="3024" w:type="dxa"/>
+          </w:tcPr>
+          <w:p>
+            <w:pPr>
+              <w:jc w:val="center"/>
+              <w:rPr>
+                <w:sz w:val="22"/>
+                <w:szCs w:val="22"/>
+              </w:rPr>
+            </w:pPr>
+            <w:r>
+              <w:rPr>
+                <w:sz w:val="22"/>
+                <w:szCs w:val="22"/>
+              </w:rPr>
+              <w:t>1 * 10</w:t>
+            </w:r>
+            <w:r>
+              <w:rPr>
+                <w:sz w:val="22"/>
+                <w:szCs w:val="22"/>
+                <w:vertAlign w:val="superscript"/>
+              </w:rPr>
+              <w:t>-</w:t>
+            </w:r>
+            <w:r>
+              <w:rPr>
+                <w:sz w:val="22"/>
+                <w:szCs w:val="22"/>
+                <w:vertAlign w:val="superscript"/>
+              </w:rPr>
+              <w:t>5</w:t>
+            </w:r>
+          </w:p>
+        </w:tc>
+      </w:tr>
+      <w:tr>
+        <w:tc>
+          <w:tcPr>
+            <w:tcW w:w="805" w:type="dxa"/>
+          </w:tcPr>
+          <w:p>
+            <w:pPr>
+              <w:pStyle w:val="ListParagraph"/>
+              <w:ind w:left="0"/>
+              <w:jc w:val="center"/>
+              <w:rPr>
+                <w:sz w:val="22"/>
+                <w:szCs w:val="22"/>
+                <w:vertAlign w:val="subscript"/>
+              </w:rPr>
+            </w:pPr>
+            <w:r>
+              <w:rPr>
+                <w:sz w:val="22"/>
+                <w:szCs w:val="22"/>
+              </w:rPr>
+              <w:t>K</w:t>
+            </w:r>
+            <w:r>
+              <w:rPr>
+                <w:sz w:val="22"/>
+                <w:szCs w:val="22"/>
+                <w:vertAlign w:val="subscript"/>
+              </w:rPr>
+              <w:t>2</w:t>
+            </w:r>
+          </w:p>
+        </w:tc>
+        <w:tc>
+          <w:tcPr>
+            <w:tcW w:w="3024" w:type="dxa"/>
+          </w:tcPr>
+          <w:p>
+            <w:pPr>
+              <w:jc w:val="center"/>
+              <w:rPr>
+                <w:rFonts w:ascii="Aptos Narrow" w:hAnsi="Aptos Narrow"/>
+                <w:color w:val="000000"/>
+                <w:sz w:val="22"/>
+                <w:szCs w:val="22"/>
+              </w:rPr>
+            </w:pPr>
+            <w:r>
+              <w:rPr>
+                <w:sz w:val="22"/>
+                <w:szCs w:val="22"/>
+              </w:rPr>
+              <w:t>5.541</w:t>
+            </w:r>
+            <w:r>
+              <w:rPr>
+                <w:sz w:val="22"/>
+                <w:szCs w:val="22"/>
+              </w:rPr>
+              <w:t xml:space="preserve"> * 10</w:t>
+            </w:r>
+            <w:r>
+              <w:rPr>
+                <w:sz w:val="22"/>
+                <w:szCs w:val="22"/>
+                <w:vertAlign w:val="superscript"/>
+              </w:rPr>
+              <w:t>-</w:t>
+            </w:r>
+            <w:r>
+              <w:rPr>
+                <w:sz w:val="22"/>
+                <w:szCs w:val="22"/>
+                <w:vertAlign w:val="superscript"/>
+              </w:rPr>
+              <w:t>5</w:t>
+            </w:r>
+          </w:p>
+        </w:tc>
+      </w:tr>
+      <w:tr>
+        <w:tc>
+          <w:tcPr>
+            <w:tcW w:w="805" w:type="dxa"/>
+          </w:tcPr>
+          <w:p>
+            <w:pPr>
+              <w:pStyle w:val="ListParagraph"/>
+              <w:ind w:left="0"/>
+              <w:jc w:val="center"/>
+              <w:rPr>
+                <w:sz w:val="22"/>
+                <w:szCs w:val="22"/>
+              </w:rPr>
+            </w:pPr>
+            <w:r>
+              <w:rPr>
+                <w:rFonts w:ascii="Calibri" w:hAnsi="Calibri" w:cs="Calibri"/>
+                <w:sz w:val="22"/>
+                <w:szCs w:val="22"/>
+              </w:rPr>
+              <w:t>ε</w:t>
+            </w:r>
+          </w:p>
+        </w:tc>
+        <w:tc>
+          <w:tcPr>
+            <w:tcW w:w="3024" w:type="dxa"/>
+          </w:tcPr>
+          <w:p>
+            <w:pPr>
+              <w:pStyle w:val="ListParagraph"/>
+              <w:ind w:left="0"/>
+              <w:jc w:val="center"/>
+              <w:rPr>
+                <w:sz w:val="22"/>
+                <w:szCs w:val="22"/>
+              </w:rPr>
+            </w:pPr>
+            <w:r>
+              <w:rPr>
+                <w:sz w:val="22"/>
+                <w:szCs w:val="22"/>
+              </w:rPr>
+              <w:t>1</w:t>
+            </w:r>
+          </w:p>
+        </w:tc>
+      </w:tr>
+    </w:tbl>
+    <w:p>
+      <w:pPr>
+        <w:pStyle w:val="ListParagraph"/>
+        <w:rPr>
+          <w:sz w:val="22"/>
+          <w:szCs w:val="22"/>
+        </w:rPr>
+      </w:pPr>
+      <w:r>
+        <w:rPr>
+          <w:sz w:val="22"/>
+          <w:szCs w:val="22"/>
+        </w:rPr>
+        <w:t xml:space="preserve">MAE = </w:t>
+      </w:r>
+      <w:r>
+        <w:rPr>
+          <w:sz w:val="22"/>
+          <w:szCs w:val="22"/>
+        </w:rPr>
+        <w:t>0.0</w:t>
+      </w:r>
+      <w:r>
+        <w:rPr>
+          <w:sz w:val="22"/>
+          <w:szCs w:val="22"/>
+        </w:rPr>
+        <w:t>152</w:t>
+      </w:r>
+    </w:p>
+    <w:p>
+      <w:pPr>
+        <w:pStyle w:val="ListParagraph"/>
+        <w:rPr>
+          <w:sz w:val="22"/>
+          <w:szCs w:val="22"/>
+        </w:rPr>
+      </w:pPr>
+    </w:p>
+    <w:p>
+      <w:pPr>
+        <w:rPr>
+          <w:sz w:val="22"/>
+          <w:szCs w:val="22"/>
+        </w:rPr>
+      </w:pPr>
+      <w:r>
+        <w:rPr>
+          <w:sz w:val="22"/>
+          <w:szCs w:val="22"/>
+        </w:rPr>
+        <w:lastRenderedPageBreak/>
+        <w:drawing>
+          <wp:inline distT="0" distB="0" distL="0" distR="0" wp14:anchorId="4E830819" wp14:editId="6BD1E3D8">
+            <wp:extent cx="5603358" cy="2207220"/>
+            <wp:effectExtent l="0" t="0" r="0" b="3175"/>
+            <wp:docPr id="1085031412" name="Picture 1"/>
+            <wp:cNvGraphicFramePr>
+              <a:graphicFrameLocks xmlns:a="http://schemas.openxmlformats.org/drawingml/2006/main" noChangeAspect="1"/>
+            </wp:cNvGraphicFramePr>
+            <a:graphic xmlns:a="http://schemas.openxmlformats.org/drawingml/2006/main">
+              <a:graphicData uri="http://schemas.openxmlformats.org/drawingml/2006/picture">
+                <pic:pic xmlns:pic="http://schemas.openxmlformats.org/drawingml/2006/picture">
+                  <pic:nvPicPr>
+                    <pic:cNvPr id="1085031412" name=""/>
+                    <pic:cNvPicPr/>
+                  </pic:nvPicPr>
+                  <pic:blipFill>
+                    <a:blip r:embed="rId23"/>
+                    <a:stretch>
+                      <a:fillRect/>
+                    </a:stretch>
+                  </pic:blipFill>
+                  <pic:spPr>
+                    <a:xfrm>
+                      <a:off x="0" y="0"/>
+                      <a:ext cx="5606253" cy="2208360"/>
+                    </a:xfrm>
+                    <a:prstGeom prst="rect">
+                      <a:avLst/>
+                    </a:prstGeom>
+                  </pic:spPr>
+                </pic:pic>
+              </a:graphicData>
+            </a:graphic>
+          </wp:inline>
+        </w:drawing>
+      </w:r>
+    </w:p>
+    <w:p>
+      <w:pPr>
+        <w:ind w:firstLine="360"/>
+      </w:pPr>
+      <w:r>
+        <w:t>Model improvement over constant τ*c</w:t>
+      </w:r>
+      <w:r>
+        <w:t xml:space="preserve">: </w:t>
+      </w:r>
+      <w:r>
+        <w:t>46.7</w:t>
+      </w:r>
+      <w:r>
+        <w:t>%</w:t>
+      </w:r>
+    </w:p>
+    <w:p>
+      <w:pPr>
+        <w:pStyle w:val="ListParagraph"/>
+      </w:pPr>
+      <w:r>
+        <w:drawing>
+          <wp:inline distT="0" distB="0" distL="0" distR="0" wp14:anchorId="11B0E32F" wp14:editId="0F0C43F4">
+            <wp:extent cx="4182794" cy="3657600"/>
+            <wp:effectExtent l="0" t="0" r="8255" b="0"/>
+            <wp:docPr id="137111076" name="Picture 1"/>
+            <wp:cNvGraphicFramePr>
+              <a:graphicFrameLocks xmlns:a="http://schemas.openxmlformats.org/drawingml/2006/main" noChangeAspect="1"/>
+            </wp:cNvGraphicFramePr>
+            <a:graphic xmlns:a="http://schemas.openxmlformats.org/drawingml/2006/main">
+              <a:graphicData uri="http://schemas.openxmlformats.org/drawingml/2006/picture">
+                <pic:pic xmlns:pic="http://schemas.openxmlformats.org/drawingml/2006/picture">
+                  <pic:nvPicPr>
+                    <pic:cNvPr id="137111076" name=""/>
+                    <pic:cNvPicPr/>
+                  </pic:nvPicPr>
+                  <pic:blipFill>
+                    <a:blip r:embed="rId24"/>
+                    <a:stretch>
+                      <a:fillRect/>
+                    </a:stretch>
+                  </pic:blipFill>
+                  <pic:spPr>
+                    <a:xfrm>
+                      <a:off x="0" y="0"/>
+                      <a:ext cx="4183195" cy="3657951"/>
+                    </a:xfrm>
+                    <a:prstGeom prst="rect">
+                      <a:avLst/>
+                    </a:prstGeom>
+                  </pic:spPr>
+                </pic:pic>
+              </a:graphicData>
+            </a:graphic>
+          </wp:inline>
+        </w:drawing>
+      </w:r>
+    </w:p>
+    <w:p>
+      <w:pPr>
+        <w:pStyle w:val="ListParagraph"/>
+      </w:pPr>
+    </w:p>
+    <w:p>
+      <w:pPr>
+        <w:ind w:left="360"/>
+      </w:pPr>
+    </w:p>
+    <w:p>
+      <w:pPr>
+        <w:pStyle w:val="Heading2"/>
+        <w:ind w:left="1440"/>
+        <w:rPr>
+          <w:sz w:val="24"/>
+          <w:szCs w:val="24"/>
+        </w:rPr>
+      </w:pPr>
+    </w:p>
     <w:p/>
     <w:p/>
     <w:p/>
@@ -7313,7 +8818,7 @@
   <w:abstractNum w:abstractNumId="1" w15:restartNumberingAfterBreak="0">
     <w:nsid w:val="22315766"/>
     <w:multiLevelType w:val="hybridMultilevel"/>
-    <w:tmpl w:val="964C6CD0"/>
+    <w:tmpl w:val="703078F0"/>
     <w:lvl w:ilvl="0" w:tplc="04090011">
       <w:start w:val="1"/>
       <w:numFmt w:val="decimal"/>
@@ -7326,7 +8831,7 @@
         <w:rFonts w:hint="default"/>
       </w:rPr>
     </w:lvl>
-    <w:lvl w:ilvl="1" w:tplc="04090019" w:tentative="1">
+    <w:lvl w:ilvl="1" w:tplc="04090019">
       <w:start w:val="1"/>
       <w:numFmt w:val="lowerLetter"/>
       <w:lvlText w:val="%2."/>
@@ -7489,6 +8994,208 @@
     </w:lvl>
   </w:abstractNum>
   <w:abstractNum w:abstractNumId="3" w15:restartNumberingAfterBreak="0">
+    <w:nsid w:val="28C666A6"/>
+    <w:multiLevelType w:val="hybridMultilevel"/>
+    <w:tmpl w:val="964C6CD0"/>
+    <w:lvl w:ilvl="0" w:tplc="FFFFFFFF">
+      <w:start w:val="1"/>
+      <w:numFmt w:val="decimal"/>
+      <w:lvlText w:val="%1)"/>
+      <w:lvlJc w:val="left"/>
+      <w:pPr>
+        <w:ind w:left="720" w:hanging="360"/>
+      </w:pPr>
+      <w:rPr>
+        <w:rFonts w:hint="default"/>
+      </w:rPr>
+    </w:lvl>
+    <w:lvl w:ilvl="1" w:tplc="FFFFFFFF" w:tentative="1">
+      <w:start w:val="1"/>
+      <w:numFmt w:val="lowerLetter"/>
+      <w:lvlText w:val="%2."/>
+      <w:lvlJc w:val="left"/>
+      <w:pPr>
+        <w:ind w:left="1440" w:hanging="360"/>
+      </w:pPr>
+    </w:lvl>
+    <w:lvl w:ilvl="2" w:tplc="FFFFFFFF" w:tentative="1">
+      <w:start w:val="1"/>
+      <w:numFmt w:val="lowerRoman"/>
+      <w:lvlText w:val="%3."/>
+      <w:lvlJc w:val="right"/>
+      <w:pPr>
+        <w:ind w:left="2160" w:hanging="180"/>
+      </w:pPr>
+    </w:lvl>
+    <w:lvl w:ilvl="3" w:tplc="FFFFFFFF" w:tentative="1">
+      <w:start w:val="1"/>
+      <w:numFmt w:val="decimal"/>
+      <w:lvlText w:val="%4."/>
+      <w:lvlJc w:val="left"/>
+      <w:pPr>
+        <w:ind w:left="2880" w:hanging="360"/>
+      </w:pPr>
+    </w:lvl>
+    <w:lvl w:ilvl="4" w:tplc="FFFFFFFF" w:tentative="1">
+      <w:start w:val="1"/>
+      <w:numFmt w:val="lowerLetter"/>
+      <w:lvlText w:val="%5."/>
+      <w:lvlJc w:val="left"/>
+      <w:pPr>
+        <w:ind w:left="3600" w:hanging="360"/>
+      </w:pPr>
+    </w:lvl>
+    <w:lvl w:ilvl="5" w:tplc="FFFFFFFF" w:tentative="1">
+      <w:start w:val="1"/>
+      <w:numFmt w:val="lowerRoman"/>
+      <w:lvlText w:val="%6."/>
+      <w:lvlJc w:val="right"/>
+      <w:pPr>
+        <w:ind w:left="4320" w:hanging="180"/>
+      </w:pPr>
+    </w:lvl>
+    <w:lvl w:ilvl="6" w:tplc="FFFFFFFF" w:tentative="1">
+      <w:start w:val="1"/>
+      <w:numFmt w:val="decimal"/>
+      <w:lvlText w:val="%7."/>
+      <w:lvlJc w:val="left"/>
+      <w:pPr>
+        <w:ind w:left="5040" w:hanging="360"/>
+      </w:pPr>
+    </w:lvl>
+    <w:lvl w:ilvl="7" w:tplc="FFFFFFFF" w:tentative="1">
+      <w:start w:val="1"/>
+      <w:numFmt w:val="lowerLetter"/>
+      <w:lvlText w:val="%8."/>
+      <w:lvlJc w:val="left"/>
+      <w:pPr>
+        <w:ind w:left="5760" w:hanging="360"/>
+      </w:pPr>
+    </w:lvl>
+    <w:lvl w:ilvl="8" w:tplc="FFFFFFFF" w:tentative="1">
+      <w:start w:val="1"/>
+      <w:numFmt w:val="lowerRoman"/>
+      <w:lvlText w:val="%9."/>
+      <w:lvlJc w:val="right"/>
+      <w:pPr>
+        <w:ind w:left="6480" w:hanging="180"/>
+      </w:pPr>
+    </w:lvl>
+  </w:abstractNum>
+  <w:abstractNum w:abstractNumId="4" w15:restartNumberingAfterBreak="0">
+    <w:nsid w:val="2BAB0491"/>
+    <w:multiLevelType w:val="multilevel"/>
+    <w:tmpl w:val="183650DE"/>
+    <w:lvl w:ilvl="0">
+      <w:start w:val="4"/>
+      <w:numFmt w:val="decimal"/>
+      <w:lvlText w:val="%1."/>
+      <w:lvlJc w:val="left"/>
+      <w:pPr>
+        <w:ind w:left="360" w:hanging="360"/>
+      </w:pPr>
+      <w:rPr>
+        <w:rFonts w:hint="default"/>
+      </w:rPr>
+    </w:lvl>
+    <w:lvl w:ilvl="1">
+      <w:start w:val="5"/>
+      <w:numFmt w:val="decimal"/>
+      <w:lvlText w:val="%1.%2)"/>
+      <w:lvlJc w:val="left"/>
+      <w:pPr>
+        <w:ind w:left="720" w:hanging="720"/>
+      </w:pPr>
+      <w:rPr>
+        <w:rFonts w:hint="default"/>
+      </w:rPr>
+    </w:lvl>
+    <w:lvl w:ilvl="2">
+      <w:start w:val="1"/>
+      <w:numFmt w:val="decimal"/>
+      <w:lvlText w:val="%1.%2)%3."/>
+      <w:lvlJc w:val="left"/>
+      <w:pPr>
+        <w:ind w:left="720" w:hanging="720"/>
+      </w:pPr>
+      <w:rPr>
+        <w:rFonts w:hint="default"/>
+      </w:rPr>
+    </w:lvl>
+    <w:lvl w:ilvl="3">
+      <w:start w:val="1"/>
+      <w:numFmt w:val="decimal"/>
+      <w:lvlText w:val="%1.%2)%3.%4."/>
+      <w:lvlJc w:val="left"/>
+      <w:pPr>
+        <w:ind w:left="1080" w:hanging="1080"/>
+      </w:pPr>
+      <w:rPr>
+        <w:rFonts w:hint="default"/>
+      </w:rPr>
+    </w:lvl>
+    <w:lvl w:ilvl="4">
+      <w:start w:val="1"/>
+      <w:numFmt w:val="decimal"/>
+      <w:lvlText w:val="%1.%2)%3.%4.%5."/>
+      <w:lvlJc w:val="left"/>
+      <w:pPr>
+        <w:ind w:left="1080" w:hanging="1080"/>
+      </w:pPr>
+      <w:rPr>
+        <w:rFonts w:hint="default"/>
+      </w:rPr>
+    </w:lvl>
+    <w:lvl w:ilvl="5">
+      <w:start w:val="1"/>
+      <w:numFmt w:val="decimal"/>
+      <w:lvlText w:val="%1.%2)%3.%4.%5.%6."/>
+      <w:lvlJc w:val="left"/>
+      <w:pPr>
+        <w:ind w:left="1440" w:hanging="1440"/>
+      </w:pPr>
+      <w:rPr>
+        <w:rFonts w:hint="default"/>
+      </w:rPr>
+    </w:lvl>
+    <w:lvl w:ilvl="6">
+      <w:start w:val="1"/>
+      <w:numFmt w:val="decimal"/>
+      <w:lvlText w:val="%1.%2)%3.%4.%5.%6.%7."/>
+      <w:lvlJc w:val="left"/>
+      <w:pPr>
+        <w:ind w:left="1440" w:hanging="1440"/>
+      </w:pPr>
+      <w:rPr>
+        <w:rFonts w:hint="default"/>
+      </w:rPr>
+    </w:lvl>
+    <w:lvl w:ilvl="7">
+      <w:start w:val="1"/>
+      <w:numFmt w:val="decimal"/>
+      <w:lvlText w:val="%1.%2)%3.%4.%5.%6.%7.%8."/>
+      <w:lvlJc w:val="left"/>
+      <w:pPr>
+        <w:ind w:left="1800" w:hanging="1800"/>
+      </w:pPr>
+      <w:rPr>
+        <w:rFonts w:hint="default"/>
+      </w:rPr>
+    </w:lvl>
+    <w:lvl w:ilvl="8">
+      <w:start w:val="1"/>
+      <w:numFmt w:val="decimal"/>
+      <w:lvlText w:val="%1.%2)%3.%4.%5.%6.%7.%8.%9."/>
+      <w:lvlJc w:val="left"/>
+      <w:pPr>
+        <w:ind w:left="1800" w:hanging="1800"/>
+      </w:pPr>
+      <w:rPr>
+        <w:rFonts w:hint="default"/>
+      </w:rPr>
+    </w:lvl>
+  </w:abstractNum>
+  <w:abstractNum w:abstractNumId="5" w15:restartNumberingAfterBreak="0">
     <w:nsid w:val="393564EC"/>
     <w:multiLevelType w:val="multilevel"/>
     <w:tmpl w:val="1C763AA2"/>
@@ -7601,7 +9308,7 @@
       </w:rPr>
     </w:lvl>
   </w:abstractNum>
-  <w:abstractNum w:abstractNumId="4" w15:restartNumberingAfterBreak="0">
+  <w:abstractNum w:abstractNumId="6" w15:restartNumberingAfterBreak="0">
     <w:nsid w:val="46476137"/>
     <w:multiLevelType w:val="multilevel"/>
     <w:tmpl w:val="8C9EFAB0"/>
@@ -7714,7 +9421,7 @@
       </w:rPr>
     </w:lvl>
   </w:abstractNum>
-  <w:abstractNum w:abstractNumId="5" w15:restartNumberingAfterBreak="0">
+  <w:abstractNum w:abstractNumId="7" w15:restartNumberingAfterBreak="0">
     <w:nsid w:val="4B912B6C"/>
     <w:multiLevelType w:val="multilevel"/>
     <w:tmpl w:val="1BD637FA"/>
@@ -7837,13 +9544,19 @@
     <w:abstractNumId w:val="0"/>
   </w:num>
   <w:num w:numId="4" w16cid:durableId="1567912114">
-    <w:abstractNumId w:val="4"/>
+    <w:abstractNumId w:val="6"/>
   </w:num>
   <w:num w:numId="5" w16cid:durableId="1504857847">
+    <w:abstractNumId w:val="5"/>
+  </w:num>
+  <w:num w:numId="6" w16cid:durableId="1800175335">
+    <w:abstractNumId w:val="7"/>
+  </w:num>
+  <w:num w:numId="7" w16cid:durableId="727730457">
     <w:abstractNumId w:val="3"/>
   </w:num>
-  <w:num w:numId="6" w16cid:durableId="1800175335">
-    <w:abstractNumId w:val="5"/>
+  <w:num w:numId="8" w16cid:durableId="987594237">
+    <w:abstractNumId w:val="4"/>
   </w:num>
 </w:numbering>
 </file>

</xml_diff>